<commit_message>
Add Figma Make link to evidence doc
</commit_message>
<xml_diff>
--- a/documents/team-b/UX/Core-MVP-UX-Evidence-Demo-Handoff.docx
+++ b/documents/team-b/UX/Core-MVP-UX-Evidence-Demo-Handoff.docx
@@ -1,6 +1,6 @@
 
 <file path=word/document.xml><?xml version="1.0" encoding="utf-8"?>
-<w:document xmlns:wpc="http://schemas.microsoft.com/office/word/2010/wordprocessingCanvas" xmlns:mc="http://schemas.openxmlformats.org/markup-compatibility/2006" xmlns:o="urn:schemas-microsoft-com:office:office" xmlns:r="http://schemas.openxmlformats.org/officeDocument/2006/relationships" xmlns:m="http://schemas.openxmlformats.org/officeDocument/2006/math" xmlns:v="urn:schemas-microsoft-com:vml" xmlns:wp14="http://schemas.microsoft.com/office/word/2010/wordprocessingDrawing" xmlns:wp="http://schemas.openxmlformats.org/drawingml/2006/wordprocessingDrawing" xmlns:w10="urn:schemas-microsoft-com:office:word" xmlns:w="http://schemas.openxmlformats.org/wordprocessingml/2006/main" xmlns:w14="http://schemas.microsoft.com/office/word/2010/wordml" xmlns:w15="http://schemas.microsoft.com/office/word/2012/wordml" xmlns:wpg="http://schemas.microsoft.com/office/word/2010/wordprocessingGroup" xmlns:wpi="http://schemas.microsoft.com/office/word/2010/wordprocessingInk" xmlns:wne="http://schemas.microsoft.com/office/word/2006/wordml" xmlns:wps="http://schemas.microsoft.com/office/word/2010/wordprocessingShape" xmlns:cx="http://schemas.microsoft.com/office/drawing/2014/chartex" xmlns:cx1="http://schemas.microsoft.com/office/drawing/2015/9/8/chartex" xmlns:cx2="http://schemas.microsoft.com/office/drawing/2015/10/21/chartex" xmlns:cx3="http://schemas.microsoft.com/office/drawing/2016/5/9/chartex" xmlns:cx4="http://schemas.microsoft.com/office/drawing/2016/5/10/chartex" xmlns:cx5="http://schemas.microsoft.com/office/drawing/2016/5/11/chartex" xmlns:cx6="http://schemas.microsoft.com/office/drawing/2016/5/12/chartex" xmlns:cx7="http://schemas.microsoft.com/office/drawing/2016/5/13/chartex" xmlns:cx8="http://schemas.microsoft.com/office/drawing/2016/5/14/chartex" xmlns:aink="http://schemas.microsoft.com/office/drawing/2016/ink" xmlns:am3d="http://schemas.microsoft.com/office/drawing/2017/model3d" xmlns:w16cex="http://schemas.microsoft.com/office/word/2018/wordml/cex" xmlns:w16cid="http://schemas.microsoft.com/office/word/2016/wordml/cid" xmlns:w16="http://schemas.microsoft.com/office/word/2018/wordml" xmlns:w16sdtdh="http://schemas.microsoft.com/office/word/2020/wordml/sdtdatahash" xmlns:w16se="http://schemas.microsoft.com/office/word/2015/wordml/symex" mc:Ignorable="w14 w15 wp14">
+<w:document xmlns:wpc="http://schemas.microsoft.com/office/word/2010/wordprocessingCanvas" xmlns:cx="http://schemas.microsoft.com/office/drawing/2014/chartex" xmlns:cx1="http://schemas.microsoft.com/office/drawing/2015/9/8/chartex" xmlns:cx2="http://schemas.microsoft.com/office/drawing/2015/10/21/chartex" xmlns:cx3="http://schemas.microsoft.com/office/drawing/2016/5/9/chartex" xmlns:cx4="http://schemas.microsoft.com/office/drawing/2016/5/10/chartex" xmlns:cx5="http://schemas.microsoft.com/office/drawing/2016/5/11/chartex" xmlns:cx6="http://schemas.microsoft.com/office/drawing/2016/5/12/chartex" xmlns:cx7="http://schemas.microsoft.com/office/drawing/2016/5/13/chartex" xmlns:cx8="http://schemas.microsoft.com/office/drawing/2016/5/14/chartex" xmlns:mc="http://schemas.openxmlformats.org/markup-compatibility/2006" xmlns:aink="http://schemas.microsoft.com/office/drawing/2016/ink" xmlns:am3d="http://schemas.microsoft.com/office/drawing/2017/model3d" xmlns:o="urn:schemas-microsoft-com:office:office" xmlns:oel="http://schemas.microsoft.com/office/2019/extlst" xmlns:r="http://schemas.openxmlformats.org/officeDocument/2006/relationships" xmlns:m="http://schemas.openxmlformats.org/officeDocument/2006/math" xmlns:v="urn:schemas-microsoft-com:vml" xmlns:wp14="http://schemas.microsoft.com/office/word/2010/wordprocessingDrawing" xmlns:wp="http://schemas.openxmlformats.org/drawingml/2006/wordprocessingDrawing" xmlns:w10="urn:schemas-microsoft-com:office:word" xmlns:w="http://schemas.openxmlformats.org/wordprocessingml/2006/main" xmlns:w14="http://schemas.microsoft.com/office/word/2010/wordml" xmlns:w15="http://schemas.microsoft.com/office/word/2012/wordml" xmlns:w16cex="http://schemas.microsoft.com/office/word/2018/wordml/cex" xmlns:w16cid="http://schemas.microsoft.com/office/word/2016/wordml/cid" xmlns:w16="http://schemas.microsoft.com/office/word/2018/wordml" xmlns:w16du="http://schemas.microsoft.com/office/word/2023/wordml/word16du" xmlns:w16sdtdh="http://schemas.microsoft.com/office/word/2020/wordml/sdtdatahash" xmlns:w16sdtfl="http://schemas.microsoft.com/office/word/2024/wordml/sdtformatlock" xmlns:w16se="http://schemas.microsoft.com/office/word/2015/wordml/symex" xmlns:wpg="http://schemas.microsoft.com/office/word/2010/wordprocessingGroup" xmlns:wpi="http://schemas.microsoft.com/office/word/2010/wordprocessingInk" xmlns:wne="http://schemas.microsoft.com/office/word/2006/wordml" xmlns:wps="http://schemas.microsoft.com/office/word/2010/wordprocessingShape" mc:Ignorable="w14 w15 w16se w16cid w16 w16cex w16sdtdh w16sdtfl w16du wp14">
   <w:body>
     <w:p>
       <w:pPr>
@@ -15,7 +15,7 @@
           <w:sz w:val="40"/>
           <w:szCs w:val="40"/>
         </w:rPr>
-        <w:t xml:space="preserve">Core MVP — UX Evidence &amp; Demo Handoff</w:t>
+        <w:t>Core MVP — UX Evidence &amp; Demo Handoff</w:t>
       </w:r>
     </w:p>
     <w:p>
@@ -30,7 +30,7 @@
           <w:sz w:val="22"/>
           <w:szCs w:val="22"/>
         </w:rPr>
-        <w:t xml:space="preserve">Sprint 2 Playback — Team 40 / Team B (Intern Management System for Social Enterprise Workforce Development)</w:t>
+        <w:t>Sprint 2 Playback — Team 40 / Team B (Intern Management System for Social Enterprise Workforce Development)</w:t>
       </w:r>
     </w:p>
     <w:p>
@@ -43,39 +43,55 @@
           <w:sz w:val="18"/>
           <w:szCs w:val="18"/>
         </w:rPr>
-        <w:t xml:space="preserve">Prepared by: Faridullah Jabbar Khil (s4100674) — UX</w:t>
-      </w:r>
-    </w:p>
-    <w:p>
-      <w:pPr>
-        <w:spacing w:after="40"/>
-      </w:pPr>
+        <w:t>Prepared by: Faridullah Jabbar Khil (s</w:t>
+      </w:r>
       <w:r>
         <w:rPr>
           <w:color w:val="6B7280"/>
           <w:sz w:val="18"/>
           <w:szCs w:val="18"/>
         </w:rPr>
-        <w:t xml:space="preserve">Task: [SPRINT PLAYBACK] – Core MVP UX Evidence &amp; Demo Handoff · Sprint 2 Playback</w:t>
-      </w:r>
-    </w:p>
-    <w:p>
-      <w:pPr>
-        <w:spacing w:after="40"/>
-      </w:pPr>
+        <w:t>4020393</w:t>
+      </w:r>
       <w:r>
         <w:rPr>
           <w:color w:val="6B7280"/>
           <w:sz w:val="18"/>
           <w:szCs w:val="18"/>
         </w:rPr>
-        <w:t xml:space="preserve">Purpose: give the PM presentation-ready evidence of the progression from approved design to implemented Core MVP, with fallback visual evidence in case the live demo is unavailable.</w:t>
+        <w:t>) — UX</w:t>
+      </w:r>
+    </w:p>
+    <w:p>
+      <w:pPr>
+        <w:spacing w:after="40"/>
+      </w:pPr>
+      <w:r>
+        <w:rPr>
+          <w:color w:val="6B7280"/>
+          <w:sz w:val="18"/>
+          <w:szCs w:val="18"/>
+        </w:rPr>
+        <w:t>Task: [SPRINT PLAYBACK] – Core MVP UX Evidence &amp; Demo Handoff · Sprint 2 Playback</w:t>
+      </w:r>
+    </w:p>
+    <w:p>
+      <w:pPr>
+        <w:spacing w:after="40"/>
+      </w:pPr>
+      <w:r>
+        <w:rPr>
+          <w:color w:val="6B7280"/>
+          <w:sz w:val="18"/>
+          <w:szCs w:val="18"/>
+        </w:rPr>
+        <w:t>Purpose: give the PM presentation-ready evidence of the progression from approved design to implemented Core MVP, with fallback visual evidence in case the live demo is unavailable.</w:t>
       </w:r>
     </w:p>
     <w:p>
       <w:pPr>
         <w:pStyle w:val="Heading1"/>
-        <w:spacing w:after="140" w:before="320"/>
+        <w:spacing w:before="320" w:after="140"/>
       </w:pPr>
       <w:r>
         <w:rPr>
@@ -85,40 +101,51 @@
           <w:sz w:val="28"/>
           <w:szCs w:val="28"/>
         </w:rPr>
-        <w:t xml:space="preserve">1. Purpose &amp; Scope</w:t>
+        <w:t>1. Purpose &amp; Scope</w:t>
       </w:r>
     </w:p>
     <w:tbl>
       <w:tblPr>
-        <w:tblW w:type="pct" w:w="100%"/>
+        <w:tblW w:w="5000" w:type="pct"/>
         <w:tblBorders>
-          <w:top w:val="single" w:color="auto" w:sz="4"/>
-          <w:left w:val="single" w:color="auto" w:sz="4"/>
-          <w:bottom w:val="single" w:color="auto" w:sz="4"/>
-          <w:right w:val="single" w:color="auto" w:sz="4"/>
-          <w:insideH w:val="single" w:color="auto" w:sz="4"/>
-          <w:insideV w:val="single" w:color="auto" w:sz="4"/>
+          <w:top w:val="single" w:sz="4" w:space="0" w:color="auto"/>
+          <w:left w:val="single" w:sz="4" w:space="0" w:color="auto"/>
+          <w:bottom w:val="single" w:sz="4" w:space="0" w:color="auto"/>
+          <w:right w:val="single" w:sz="4" w:space="0" w:color="auto"/>
+          <w:insideH w:val="single" w:sz="4" w:space="0" w:color="auto"/>
+          <w:insideV w:val="single" w:sz="4" w:space="0" w:color="auto"/>
         </w:tblBorders>
+        <w:tblCellMar>
+          <w:left w:w="10" w:type="dxa"/>
+          <w:right w:w="10" w:type="dxa"/>
+        </w:tblCellMar>
+        <w:tblLook w:val="0000" w:firstRow="0" w:lastRow="0" w:firstColumn="0" w:lastColumn="0" w:noHBand="0" w:noVBand="0"/>
       </w:tblPr>
       <w:tblGrid>
-        <w:gridCol w:w="100"/>
+        <w:gridCol w:w="9350"/>
       </w:tblGrid>
       <w:tr>
+        <w:tblPrEx>
+          <w:tblCellMar>
+            <w:top w:w="0" w:type="dxa"/>
+            <w:bottom w:w="0" w:type="dxa"/>
+          </w:tblCellMar>
+        </w:tblPrEx>
         <w:tc>
           <w:tcPr>
-            <w:tcW w:type="pct" w:w="100%"/>
+            <w:tcW w:w="5000" w:type="pct"/>
             <w:tcBorders>
-              <w:top w:val="single" w:color="1D4ED8" w:sz="4"/>
-              <w:left w:val="single" w:color="1D4ED8" w:sz="4"/>
-              <w:bottom w:val="single" w:color="1D4ED8" w:sz="4"/>
-              <w:right w:val="single" w:color="1D4ED8" w:sz="4"/>
+              <w:top w:val="single" w:sz="4" w:space="0" w:color="1D4ED8"/>
+              <w:left w:val="single" w:sz="4" w:space="0" w:color="1D4ED8"/>
+              <w:bottom w:val="single" w:sz="4" w:space="0" w:color="1D4ED8"/>
+              <w:right w:val="single" w:sz="4" w:space="0" w:color="1D4ED8"/>
             </w:tcBorders>
-            <w:shd w:fill="EFF6FF" w:val="clear"/>
+            <w:shd w:val="clear" w:color="auto" w:fill="EFF6FF"/>
             <w:tcMar>
-              <w:top w:type="dxa" w:w="120"/>
-              <w:left w:type="dxa" w:w="160"/>
-              <w:bottom w:type="dxa" w:w="120"/>
-              <w:right w:type="dxa" w:w="160"/>
+              <w:top w:w="120" w:type="dxa"/>
+              <w:left w:w="160" w:type="dxa"/>
+              <w:bottom w:w="120" w:type="dxa"/>
+              <w:right w:w="160" w:type="dxa"/>
             </w:tcMar>
           </w:tcPr>
           <w:p>
@@ -130,19 +157,13 @@
                 <w:b/>
                 <w:bCs/>
                 <w:color w:val="1D4ED8"/>
-                <w:sz w:val="20"/>
-                <w:szCs w:val="20"/>
               </w:rPr>
-              <w:t xml:space="preserve">PM task description</w:t>
+              <w:t>PM task description</w:t>
             </w:r>
           </w:p>
           <w:p>
             <w:r>
-              <w:rPr>
-                <w:sz w:val="20"/>
-                <w:szCs w:val="20"/>
-              </w:rPr>
-              <w:t xml:space="preserve">“Prepare the visual and UX evidence required for the Sprint 2 Playback so the PM can clearly demonstrate the progression from approved design and client feedback to the implemented Core MVP. This is not functional acceptance testing. Prepare presentation-ready evidence from the approved Figma/prototype and current implementation, including fallback visual evidence if the live demo becomes unavailable. Sprint 2 Playback requires actual working achievement to be shown rather than only described.”</w:t>
+              <w:t>“Prepare the visual and UX evidence required for the Sprint 2 Playback so the PM can clearly demonstrate the progression from approved design and client feedback to the implemented Core MVP. This is not functional acceptance testing. Prepare presentation-ready evidence from the approved Figma/prototype and current implementation, including fallback visual evidence if the live demo becomes unavailable. Sprint 2 Playback requires actual working achievement to be shown rather than only described.”</w:t>
             </w:r>
           </w:p>
         </w:tc>
@@ -162,13 +183,45 @@
           <w:sz w:val="21"/>
           <w:szCs w:val="21"/>
         </w:rPr>
-        <w:t xml:space="preserve">The design side of every comparison below is the refined Core MVP prototype (App.tsx, v5) following the Final UI &amp; Interaction Polish task — this is also what the team's Figma Make file reflects, since no changes were made to it after that polish pass. The implementation side is DEV's current deployed build (Vercel), captured live and logged in as the relevant role.</w:t>
+        <w:t>The design side of every comparison below is the refined Core MVP prototype (</w:t>
+      </w:r>
+      <w:proofErr w:type="spellStart"/>
+      <w:r>
+        <w:rPr>
+          <w:sz w:val="21"/>
+          <w:szCs w:val="21"/>
+        </w:rPr>
+        <w:t>App.tsx</w:t>
+      </w:r>
+      <w:proofErr w:type="spellEnd"/>
+      <w:r>
+        <w:rPr>
+          <w:sz w:val="21"/>
+          <w:szCs w:val="21"/>
+        </w:rPr>
+        <w:t>, v5) following the Final UI &amp; Interaction Polish task — this is also what the team's Figma Make file reflects, since no changes were made to it after that polish pass. The implementation side is DEV's current deployed build (</w:t>
+      </w:r>
+      <w:proofErr w:type="spellStart"/>
+      <w:r>
+        <w:rPr>
+          <w:sz w:val="21"/>
+          <w:szCs w:val="21"/>
+        </w:rPr>
+        <w:t>Vercel</w:t>
+      </w:r>
+      <w:proofErr w:type="spellEnd"/>
+      <w:r>
+        <w:rPr>
+          <w:sz w:val="21"/>
+          <w:szCs w:val="21"/>
+        </w:rPr>
+        <w:t>), captured live and logged in as the relevant role.</w:t>
       </w:r>
     </w:p>
     <w:p>
       <w:pPr>
         <w:pStyle w:val="Heading1"/>
-        <w:spacing w:after="140" w:before="320"/>
+        <w:spacing w:before="320" w:after="140"/>
       </w:pPr>
       <w:r>
         <w:rPr>
@@ -178,7 +231,7 @@
           <w:sz w:val="28"/>
           <w:szCs w:val="28"/>
         </w:rPr>
-        <w:t xml:space="preserve">2. Design → Implementation Comparisons</w:t>
+        <w:t>2. Design → Implementation Comparisons</w:t>
       </w:r>
     </w:p>
     <w:p>
@@ -190,13 +243,13 @@
           <w:sz w:val="21"/>
           <w:szCs w:val="21"/>
         </w:rPr>
-        <w:t xml:space="preserve">Four screens, chosen because they cover both roles and carry the Sprint 2 client-requested changes (Section 3).</w:t>
+        <w:t>Four screens, chosen because they cover both roles and carry the Sprint 2 client-requested changes (Section 3).</w:t>
       </w:r>
     </w:p>
     <w:p>
       <w:pPr>
         <w:pStyle w:val="Heading2"/>
-        <w:spacing w:after="100" w:before="220"/>
+        <w:spacing w:before="220" w:after="100"/>
       </w:pPr>
       <w:r>
         <w:rPr>
@@ -206,31 +259,34 @@
           <w:sz w:val="24"/>
           <w:szCs w:val="24"/>
         </w:rPr>
-        <w:t xml:space="preserve">2.1 Intern — My Tasks</w:t>
+        <w:t>2.1 Intern — My Tasks</w:t>
       </w:r>
     </w:p>
     <w:tbl>
       <w:tblPr>
-        <w:tblW w:type="pct" w:w="100%"/>
-        <w:tblBorders>
-          <w:top w:val="none"/>
-          <w:left w:val="none"/>
-          <w:bottom w:val="none"/>
-          <w:right w:val="none"/>
-          <w:insideH w:val="none"/>
-          <w:insideV w:val="none"/>
-        </w:tblBorders>
+        <w:tblW w:w="5000" w:type="pct"/>
+        <w:tblCellMar>
+          <w:left w:w="10" w:type="dxa"/>
+          <w:right w:w="10" w:type="dxa"/>
+        </w:tblCellMar>
+        <w:tblLook w:val="0000" w:firstRow="0" w:lastRow="0" w:firstColumn="0" w:lastColumn="0" w:noHBand="0" w:noVBand="0"/>
       </w:tblPr>
       <w:tblGrid>
-        <w:gridCol w:w="100"/>
-        <w:gridCol w:w="100"/>
+        <w:gridCol w:w="4680"/>
+        <w:gridCol w:w="4680"/>
       </w:tblGrid>
       <w:tr>
+        <w:tblPrEx>
+          <w:tblCellMar>
+            <w:top w:w="0" w:type="dxa"/>
+            <w:bottom w:w="0" w:type="dxa"/>
+          </w:tblCellMar>
+        </w:tblPrEx>
         <w:tc>
           <w:tcPr>
-            <w:tcW w:type="pct" w:w="50%"/>
+            <w:tcW w:w="2500" w:type="pct"/>
             <w:tcMar>
-              <w:right w:type="dxa" w:w="100"/>
+              <w:right w:w="100" w:type="dxa"/>
             </w:tcMar>
           </w:tcPr>
           <w:p>
@@ -238,11 +294,14 @@
               <w:jc w:val="center"/>
             </w:pPr>
             <w:r>
+              <w:rPr>
+                <w:noProof/>
+              </w:rPr>
               <w:drawing>
-                <wp:inline distT="0" distB="0" distL="0" distR="0">
+                <wp:inline distT="0" distB="0" distL="0" distR="0" wp14:anchorId="067DF273" wp14:editId="28CAE997">
                   <wp:extent cx="2857500" cy="1809750"/>
-                  <wp:effectExtent t="0" r="0" b="0" l="0"/>
-                  <wp:docPr id="1" name="" descr="" title=""/>
+                  <wp:effectExtent l="0" t="0" r="0" b="0"/>
+                  <wp:docPr id="1" name="Picture 1"/>
                   <wp:cNvGraphicFramePr>
                     <a:graphicFrameLocks xmlns:a="http://schemas.openxmlformats.org/drawingml/2006/main" noChangeAspect="1"/>
                   </wp:cNvGraphicFramePr>
@@ -250,13 +309,13 @@
                     <a:graphicData uri="http://schemas.openxmlformats.org/drawingml/2006/picture">
                       <pic:pic xmlns:pic="http://schemas.openxmlformats.org/drawingml/2006/picture">
                         <pic:nvPicPr>
-                          <pic:cNvPr id="0" name="" descr=""/>
+                          <pic:cNvPr id="0" name=""/>
                           <pic:cNvPicPr>
                             <a:picLocks noChangeAspect="1" noChangeArrowheads="1"/>
                           </pic:cNvPicPr>
                         </pic:nvPicPr>
                         <pic:blipFill>
-                          <a:blip r:embed="rId7" cstate="none"/>
+                          <a:blip r:embed="rId5"/>
                           <a:srcRect/>
                           <a:stretch>
                             <a:fillRect/>
@@ -291,15 +350,15 @@
                 <w:sz w:val="16"/>
                 <w:szCs w:val="16"/>
               </w:rPr>
-              <w:t xml:space="preserve">Design (prototype) — single placeholder task, illustrative status/priority colours</w:t>
+              <w:t>Design (prototype) — single placeholder task, illustrative status/priority colours</w:t>
             </w:r>
           </w:p>
         </w:tc>
         <w:tc>
           <w:tcPr>
-            <w:tcW w:type="pct" w:w="50%"/>
+            <w:tcW w:w="2500" w:type="pct"/>
             <w:tcMar>
-              <w:left w:type="dxa" w:w="100"/>
+              <w:left w:w="100" w:type="dxa"/>
             </w:tcMar>
           </w:tcPr>
           <w:p>
@@ -307,11 +366,14 @@
               <w:jc w:val="center"/>
             </w:pPr>
             <w:r>
+              <w:rPr>
+                <w:noProof/>
+              </w:rPr>
               <w:drawing>
-                <wp:inline distT="0" distB="0" distL="0" distR="0">
+                <wp:inline distT="0" distB="0" distL="0" distR="0" wp14:anchorId="0B700818" wp14:editId="63F34A12">
                   <wp:extent cx="2857500" cy="2562225"/>
-                  <wp:effectExtent t="0" r="0" b="0" l="0"/>
-                  <wp:docPr id="1" name="" descr="" title=""/>
+                  <wp:effectExtent l="0" t="0" r="0" b="0"/>
+                  <wp:docPr id="1185803554" name="Picture 1185803554"/>
                   <wp:cNvGraphicFramePr>
                     <a:graphicFrameLocks xmlns:a="http://schemas.openxmlformats.org/drawingml/2006/main" noChangeAspect="1"/>
                   </wp:cNvGraphicFramePr>
@@ -319,13 +381,13 @@
                     <a:graphicData uri="http://schemas.openxmlformats.org/drawingml/2006/picture">
                       <pic:pic xmlns:pic="http://schemas.openxmlformats.org/drawingml/2006/picture">
                         <pic:nvPicPr>
-                          <pic:cNvPr id="0" name="" descr=""/>
+                          <pic:cNvPr id="0" name=""/>
                           <pic:cNvPicPr>
                             <a:picLocks noChangeAspect="1" noChangeArrowheads="1"/>
                           </pic:cNvPicPr>
                         </pic:nvPicPr>
                         <pic:blipFill>
-                          <a:blip r:embed="rId8" cstate="none"/>
+                          <a:blip r:embed="rId6"/>
                           <a:srcRect/>
                           <a:stretch>
                             <a:fillRect/>
@@ -360,7 +422,7 @@
                 <w:sz w:val="16"/>
                 <w:szCs w:val="16"/>
               </w:rPr>
-              <w:t xml:space="preserve">Implementation — real task list, status/priority colours and layout match the approved design</w:t>
+              <w:t>Implementation — real task list, status/priority colours and layout match the approved design</w:t>
             </w:r>
           </w:p>
         </w:tc>
@@ -374,7 +436,7 @@
     <w:p>
       <w:pPr>
         <w:pStyle w:val="Heading2"/>
-        <w:spacing w:after="100" w:before="220"/>
+        <w:spacing w:before="220" w:after="100"/>
       </w:pPr>
       <w:r>
         <w:rPr>
@@ -384,31 +446,34 @@
           <w:sz w:val="24"/>
           <w:szCs w:val="24"/>
         </w:rPr>
-        <w:t xml:space="preserve">2.2 Intern — Task Detail</w:t>
+        <w:t>2.2 Intern — Task Detail</w:t>
       </w:r>
     </w:p>
     <w:tbl>
       <w:tblPr>
-        <w:tblW w:type="pct" w:w="100%"/>
-        <w:tblBorders>
-          <w:top w:val="none"/>
-          <w:left w:val="none"/>
-          <w:bottom w:val="none"/>
-          <w:right w:val="none"/>
-          <w:insideH w:val="none"/>
-          <w:insideV w:val="none"/>
-        </w:tblBorders>
+        <w:tblW w:w="5000" w:type="pct"/>
+        <w:tblCellMar>
+          <w:left w:w="10" w:type="dxa"/>
+          <w:right w:w="10" w:type="dxa"/>
+        </w:tblCellMar>
+        <w:tblLook w:val="0000" w:firstRow="0" w:lastRow="0" w:firstColumn="0" w:lastColumn="0" w:noHBand="0" w:noVBand="0"/>
       </w:tblPr>
       <w:tblGrid>
-        <w:gridCol w:w="100"/>
-        <w:gridCol w:w="100"/>
+        <w:gridCol w:w="4680"/>
+        <w:gridCol w:w="4680"/>
       </w:tblGrid>
       <w:tr>
+        <w:tblPrEx>
+          <w:tblCellMar>
+            <w:top w:w="0" w:type="dxa"/>
+            <w:bottom w:w="0" w:type="dxa"/>
+          </w:tblCellMar>
+        </w:tblPrEx>
         <w:tc>
           <w:tcPr>
-            <w:tcW w:type="pct" w:w="50%"/>
+            <w:tcW w:w="2500" w:type="pct"/>
             <w:tcMar>
-              <w:right w:type="dxa" w:w="100"/>
+              <w:right w:w="100" w:type="dxa"/>
             </w:tcMar>
           </w:tcPr>
           <w:p>
@@ -416,11 +481,15 @@
               <w:jc w:val="center"/>
             </w:pPr>
             <w:r>
+              <w:rPr>
+                <w:noProof/>
+              </w:rPr>
+              <w:lastRenderedPageBreak/>
               <w:drawing>
-                <wp:inline distT="0" distB="0" distL="0" distR="0">
+                <wp:inline distT="0" distB="0" distL="0" distR="0" wp14:anchorId="076D8E14" wp14:editId="10F03A35">
                   <wp:extent cx="2857500" cy="2038350"/>
-                  <wp:effectExtent t="0" r="0" b="0" l="0"/>
-                  <wp:docPr id="1" name="" descr="" title=""/>
+                  <wp:effectExtent l="0" t="0" r="0" b="0"/>
+                  <wp:docPr id="283487732" name="Picture 283487732"/>
                   <wp:cNvGraphicFramePr>
                     <a:graphicFrameLocks xmlns:a="http://schemas.openxmlformats.org/drawingml/2006/main" noChangeAspect="1"/>
                   </wp:cNvGraphicFramePr>
@@ -428,13 +497,13 @@
                     <a:graphicData uri="http://schemas.openxmlformats.org/drawingml/2006/picture">
                       <pic:pic xmlns:pic="http://schemas.openxmlformats.org/drawingml/2006/picture">
                         <pic:nvPicPr>
-                          <pic:cNvPr id="0" name="" descr=""/>
+                          <pic:cNvPr id="0" name=""/>
                           <pic:cNvPicPr>
                             <a:picLocks noChangeAspect="1" noChangeArrowheads="1"/>
                           </pic:cNvPicPr>
                         </pic:nvPicPr>
                         <pic:blipFill>
-                          <a:blip r:embed="rId9" cstate="none"/>
+                          <a:blip r:embed="rId7"/>
                           <a:srcRect/>
                           <a:stretch>
                             <a:fillRect/>
@@ -469,15 +538,15 @@
                 <w:sz w:val="16"/>
                 <w:szCs w:val="16"/>
               </w:rPr>
-              <w:t xml:space="preserve">Design (prototype) — placeholder task, confirmed status-lifecycle flow shown as a note</w:t>
+              <w:t>Design (prototype) — placeholder task, confirmed status-lifecycle flow shown as a note</w:t>
             </w:r>
           </w:p>
         </w:tc>
         <w:tc>
           <w:tcPr>
-            <w:tcW w:type="pct" w:w="50%"/>
+            <w:tcW w:w="2500" w:type="pct"/>
             <w:tcMar>
-              <w:left w:type="dxa" w:w="100"/>
+              <w:left w:w="100" w:type="dxa"/>
             </w:tcMar>
           </w:tcPr>
           <w:p>
@@ -485,11 +554,14 @@
               <w:jc w:val="center"/>
             </w:pPr>
             <w:r>
+              <w:rPr>
+                <w:noProof/>
+              </w:rPr>
               <w:drawing>
-                <wp:inline distT="0" distB="0" distL="0" distR="0">
+                <wp:inline distT="0" distB="0" distL="0" distR="0" wp14:anchorId="6AF5CBC8" wp14:editId="7297B143">
                   <wp:extent cx="2857500" cy="2476500"/>
-                  <wp:effectExtent t="0" r="0" b="0" l="0"/>
-                  <wp:docPr id="1" name="" descr="" title=""/>
+                  <wp:effectExtent l="0" t="0" r="0" b="0"/>
+                  <wp:docPr id="1063179718" name="Picture 1063179718"/>
                   <wp:cNvGraphicFramePr>
                     <a:graphicFrameLocks xmlns:a="http://schemas.openxmlformats.org/drawingml/2006/main" noChangeAspect="1"/>
                   </wp:cNvGraphicFramePr>
@@ -497,13 +569,13 @@
                     <a:graphicData uri="http://schemas.openxmlformats.org/drawingml/2006/picture">
                       <pic:pic xmlns:pic="http://schemas.openxmlformats.org/drawingml/2006/picture">
                         <pic:nvPicPr>
-                          <pic:cNvPr id="0" name="" descr=""/>
+                          <pic:cNvPr id="0" name=""/>
                           <pic:cNvPicPr>
                             <a:picLocks noChangeAspect="1" noChangeArrowheads="1"/>
                           </pic:cNvPicPr>
                         </pic:nvPicPr>
                         <pic:blipFill>
-                          <a:blip r:embed="rId10" cstate="none"/>
+                          <a:blip r:embed="rId8"/>
                           <a:srcRect/>
                           <a:stretch>
                             <a:fillRect/>
@@ -538,7 +610,7 @@
                 <w:sz w:val="16"/>
                 <w:szCs w:val="16"/>
               </w:rPr>
-              <w:t xml:space="preserve">Implementation — real task, reference attachment visible to the Intern (see Section 4)</w:t>
+              <w:t>Implementation — real task, reference attachment visible to the Intern (see Section 4)</w:t>
             </w:r>
           </w:p>
         </w:tc>
@@ -552,7 +624,7 @@
     <w:p>
       <w:pPr>
         <w:pStyle w:val="Heading2"/>
-        <w:spacing w:after="100" w:before="220"/>
+        <w:spacing w:before="220" w:after="100"/>
       </w:pPr>
       <w:r>
         <w:rPr>
@@ -562,31 +634,34 @@
           <w:sz w:val="24"/>
           <w:szCs w:val="24"/>
         </w:rPr>
-        <w:t xml:space="preserve">2.3 Intern — Weekly Progress</w:t>
+        <w:t>2.3 Intern — Weekly Progress</w:t>
       </w:r>
     </w:p>
     <w:tbl>
       <w:tblPr>
-        <w:tblW w:type="pct" w:w="100%"/>
-        <w:tblBorders>
-          <w:top w:val="none"/>
-          <w:left w:val="none"/>
-          <w:bottom w:val="none"/>
-          <w:right w:val="none"/>
-          <w:insideH w:val="none"/>
-          <w:insideV w:val="none"/>
-        </w:tblBorders>
+        <w:tblW w:w="5000" w:type="pct"/>
+        <w:tblCellMar>
+          <w:left w:w="10" w:type="dxa"/>
+          <w:right w:w="10" w:type="dxa"/>
+        </w:tblCellMar>
+        <w:tblLook w:val="0000" w:firstRow="0" w:lastRow="0" w:firstColumn="0" w:lastColumn="0" w:noHBand="0" w:noVBand="0"/>
       </w:tblPr>
       <w:tblGrid>
-        <w:gridCol w:w="100"/>
-        <w:gridCol w:w="100"/>
+        <w:gridCol w:w="4680"/>
+        <w:gridCol w:w="4680"/>
       </w:tblGrid>
       <w:tr>
+        <w:tblPrEx>
+          <w:tblCellMar>
+            <w:top w:w="0" w:type="dxa"/>
+            <w:bottom w:w="0" w:type="dxa"/>
+          </w:tblCellMar>
+        </w:tblPrEx>
         <w:tc>
           <w:tcPr>
-            <w:tcW w:type="pct" w:w="50%"/>
+            <w:tcW w:w="2500" w:type="pct"/>
             <w:tcMar>
-              <w:right w:type="dxa" w:w="100"/>
+              <w:right w:w="100" w:type="dxa"/>
             </w:tcMar>
           </w:tcPr>
           <w:p>
@@ -594,11 +669,14 @@
               <w:jc w:val="center"/>
             </w:pPr>
             <w:r>
+              <w:rPr>
+                <w:noProof/>
+              </w:rPr>
               <w:drawing>
-                <wp:inline distT="0" distB="0" distL="0" distR="0">
+                <wp:inline distT="0" distB="0" distL="0" distR="0" wp14:anchorId="4078500D" wp14:editId="62A3CE2C">
                   <wp:extent cx="2857500" cy="1809750"/>
-                  <wp:effectExtent t="0" r="0" b="0" l="0"/>
-                  <wp:docPr id="1" name="" descr="" title=""/>
+                  <wp:effectExtent l="0" t="0" r="0" b="0"/>
+                  <wp:docPr id="141004335" name="Picture 141004335"/>
                   <wp:cNvGraphicFramePr>
                     <a:graphicFrameLocks xmlns:a="http://schemas.openxmlformats.org/drawingml/2006/main" noChangeAspect="1"/>
                   </wp:cNvGraphicFramePr>
@@ -606,13 +684,13 @@
                     <a:graphicData uri="http://schemas.openxmlformats.org/drawingml/2006/picture">
                       <pic:pic xmlns:pic="http://schemas.openxmlformats.org/drawingml/2006/picture">
                         <pic:nvPicPr>
-                          <pic:cNvPr id="0" name="" descr=""/>
+                          <pic:cNvPr id="0" name=""/>
                           <pic:cNvPicPr>
                             <a:picLocks noChangeAspect="1" noChangeArrowheads="1"/>
                           </pic:cNvPicPr>
                         </pic:nvPicPr>
                         <pic:blipFill>
-                          <a:blip r:embed="rId11" cstate="none"/>
+                          <a:blip r:embed="rId9"/>
                           <a:srcRect/>
                           <a:stretch>
                             <a:fillRect/>
@@ -647,15 +725,15 @@
                 <w:sz w:val="16"/>
                 <w:szCs w:val="16"/>
               </w:rPr>
-              <w:t xml:space="preserve">Design (prototype) — empty form, three required fields</w:t>
+              <w:t>Design (prototype) — empty form, three required fields</w:t>
             </w:r>
           </w:p>
         </w:tc>
         <w:tc>
           <w:tcPr>
-            <w:tcW w:type="pct" w:w="50%"/>
+            <w:tcW w:w="2500" w:type="pct"/>
             <w:tcMar>
-              <w:left w:type="dxa" w:w="100"/>
+              <w:left w:w="100" w:type="dxa"/>
             </w:tcMar>
           </w:tcPr>
           <w:p>
@@ -663,11 +741,14 @@
               <w:jc w:val="center"/>
             </w:pPr>
             <w:r>
+              <w:rPr>
+                <w:noProof/>
+              </w:rPr>
               <w:drawing>
-                <wp:inline distT="0" distB="0" distL="0" distR="0">
+                <wp:inline distT="0" distB="0" distL="0" distR="0" wp14:anchorId="41296AD1" wp14:editId="6CF39EED">
                   <wp:extent cx="2857500" cy="2562225"/>
-                  <wp:effectExtent t="0" r="0" b="0" l="0"/>
-                  <wp:docPr id="1" name="" descr="" title=""/>
+                  <wp:effectExtent l="0" t="0" r="0" b="0"/>
+                  <wp:docPr id="566093673" name="Picture 566093673"/>
                   <wp:cNvGraphicFramePr>
                     <a:graphicFrameLocks xmlns:a="http://schemas.openxmlformats.org/drawingml/2006/main" noChangeAspect="1"/>
                   </wp:cNvGraphicFramePr>
@@ -675,13 +756,13 @@
                     <a:graphicData uri="http://schemas.openxmlformats.org/drawingml/2006/picture">
                       <pic:pic xmlns:pic="http://schemas.openxmlformats.org/drawingml/2006/picture">
                         <pic:nvPicPr>
-                          <pic:cNvPr id="0" name="" descr=""/>
+                          <pic:cNvPr id="0" name=""/>
                           <pic:cNvPicPr>
                             <a:picLocks noChangeAspect="1" noChangeArrowheads="1"/>
                           </pic:cNvPicPr>
                         </pic:nvPicPr>
                         <pic:blipFill>
-                          <a:blip r:embed="rId12" cstate="none"/>
+                          <a:blip r:embed="rId10"/>
                           <a:srcRect/>
                           <a:stretch>
                             <a:fillRect/>
@@ -716,7 +797,7 @@
                 <w:sz w:val="16"/>
                 <w:szCs w:val="16"/>
               </w:rPr>
-              <w:t xml:space="preserve">Implementation — same three fields, submitted with real content</w:t>
+              <w:t>Implementation — same three fields, submitted with real content</w:t>
             </w:r>
           </w:p>
         </w:tc>
@@ -730,7 +811,7 @@
     <w:p>
       <w:pPr>
         <w:pStyle w:val="Heading2"/>
-        <w:spacing w:after="100" w:before="220"/>
+        <w:spacing w:before="220" w:after="100"/>
       </w:pPr>
       <w:r>
         <w:rPr>
@@ -740,31 +821,34 @@
           <w:sz w:val="24"/>
           <w:szCs w:val="24"/>
         </w:rPr>
-        <w:t xml:space="preserve">2.4 Mentor — Assign Task</w:t>
+        <w:t>2.4 Mentor — Assign Task</w:t>
       </w:r>
     </w:p>
     <w:tbl>
       <w:tblPr>
-        <w:tblW w:type="pct" w:w="100%"/>
-        <w:tblBorders>
-          <w:top w:val="none"/>
-          <w:left w:val="none"/>
-          <w:bottom w:val="none"/>
-          <w:right w:val="none"/>
-          <w:insideH w:val="none"/>
-          <w:insideV w:val="none"/>
-        </w:tblBorders>
+        <w:tblW w:w="5000" w:type="pct"/>
+        <w:tblCellMar>
+          <w:left w:w="10" w:type="dxa"/>
+          <w:right w:w="10" w:type="dxa"/>
+        </w:tblCellMar>
+        <w:tblLook w:val="0000" w:firstRow="0" w:lastRow="0" w:firstColumn="0" w:lastColumn="0" w:noHBand="0" w:noVBand="0"/>
       </w:tblPr>
       <w:tblGrid>
-        <w:gridCol w:w="100"/>
-        <w:gridCol w:w="100"/>
+        <w:gridCol w:w="4680"/>
+        <w:gridCol w:w="4680"/>
       </w:tblGrid>
       <w:tr>
+        <w:tblPrEx>
+          <w:tblCellMar>
+            <w:top w:w="0" w:type="dxa"/>
+            <w:bottom w:w="0" w:type="dxa"/>
+          </w:tblCellMar>
+        </w:tblPrEx>
         <w:tc>
           <w:tcPr>
-            <w:tcW w:type="pct" w:w="50%"/>
+            <w:tcW w:w="2500" w:type="pct"/>
             <w:tcMar>
-              <w:right w:type="dxa" w:w="100"/>
+              <w:right w:w="100" w:type="dxa"/>
             </w:tcMar>
           </w:tcPr>
           <w:p>
@@ -772,11 +856,15 @@
               <w:jc w:val="center"/>
             </w:pPr>
             <w:r>
+              <w:rPr>
+                <w:noProof/>
+              </w:rPr>
+              <w:lastRenderedPageBreak/>
               <w:drawing>
-                <wp:inline distT="0" distB="0" distL="0" distR="0">
+                <wp:inline distT="0" distB="0" distL="0" distR="0" wp14:anchorId="5924E37B" wp14:editId="7737C969">
                   <wp:extent cx="2857500" cy="3133725"/>
-                  <wp:effectExtent t="0" r="0" b="0" l="0"/>
-                  <wp:docPr id="1" name="" descr="" title=""/>
+                  <wp:effectExtent l="0" t="0" r="0" b="0"/>
+                  <wp:docPr id="1862024295" name="Picture 1862024295"/>
                   <wp:cNvGraphicFramePr>
                     <a:graphicFrameLocks xmlns:a="http://schemas.openxmlformats.org/drawingml/2006/main" noChangeAspect="1"/>
                   </wp:cNvGraphicFramePr>
@@ -784,13 +872,13 @@
                     <a:graphicData uri="http://schemas.openxmlformats.org/drawingml/2006/picture">
                       <pic:pic xmlns:pic="http://schemas.openxmlformats.org/drawingml/2006/picture">
                         <pic:nvPicPr>
-                          <pic:cNvPr id="0" name="" descr=""/>
+                          <pic:cNvPr id="0" name=""/>
                           <pic:cNvPicPr>
                             <a:picLocks noChangeAspect="1" noChangeArrowheads="1"/>
                           </pic:cNvPicPr>
                         </pic:nvPicPr>
                         <pic:blipFill>
-                          <a:blip r:embed="rId13" cstate="none"/>
+                          <a:blip r:embed="rId11"/>
                           <a:srcRect/>
                           <a:stretch>
                             <a:fillRect/>
@@ -825,15 +913,15 @@
                 <w:sz w:val="16"/>
                 <w:szCs w:val="16"/>
               </w:rPr>
-              <w:t xml:space="preserve">Design (prototype) — empty form with field-level requirement annotations</w:t>
+              <w:t>Design (prototype) — empty form with field-level requirement annotations</w:t>
             </w:r>
           </w:p>
         </w:tc>
         <w:tc>
           <w:tcPr>
-            <w:tcW w:type="pct" w:w="50%"/>
+            <w:tcW w:w="2500" w:type="pct"/>
             <w:tcMar>
-              <w:left w:type="dxa" w:w="100"/>
+              <w:left w:w="100" w:type="dxa"/>
             </w:tcMar>
           </w:tcPr>
           <w:p>
@@ -841,11 +929,14 @@
               <w:jc w:val="center"/>
             </w:pPr>
             <w:r>
+              <w:rPr>
+                <w:noProof/>
+              </w:rPr>
               <w:drawing>
-                <wp:inline distT="0" distB="0" distL="0" distR="0">
+                <wp:inline distT="0" distB="0" distL="0" distR="0" wp14:anchorId="3236B848" wp14:editId="784874CD">
                   <wp:extent cx="2857500" cy="2476500"/>
-                  <wp:effectExtent t="0" r="0" b="0" l="0"/>
-                  <wp:docPr id="1" name="" descr="" title=""/>
+                  <wp:effectExtent l="0" t="0" r="0" b="0"/>
+                  <wp:docPr id="2056087285" name="Picture 2056087285"/>
                   <wp:cNvGraphicFramePr>
                     <a:graphicFrameLocks xmlns:a="http://schemas.openxmlformats.org/drawingml/2006/main" noChangeAspect="1"/>
                   </wp:cNvGraphicFramePr>
@@ -853,13 +944,13 @@
                     <a:graphicData uri="http://schemas.openxmlformats.org/drawingml/2006/picture">
                       <pic:pic xmlns:pic="http://schemas.openxmlformats.org/drawingml/2006/picture">
                         <pic:nvPicPr>
-                          <pic:cNvPr id="0" name="" descr=""/>
+                          <pic:cNvPr id="0" name=""/>
                           <pic:cNvPicPr>
                             <a:picLocks noChangeAspect="1" noChangeArrowheads="1"/>
                           </pic:cNvPicPr>
                         </pic:nvPicPr>
                         <pic:blipFill>
-                          <a:blip r:embed="rId14" cstate="none"/>
+                          <a:blip r:embed="rId12"/>
                           <a:srcRect/>
                           <a:stretch>
                             <a:fillRect/>
@@ -894,7 +985,7 @@
                 <w:sz w:val="16"/>
                 <w:szCs w:val="16"/>
               </w:rPr>
-              <w:t xml:space="preserve">Implementation — same fields, filled and submitted: title, description, reference file, due date, assigned Intern, priority, assigned-by</w:t>
+              <w:t>Implementation — same fields, filled and submitted: title, description, reference file, due date, assigned Intern, priority, assigned-by</w:t>
             </w:r>
           </w:p>
         </w:tc>
@@ -903,7 +994,7 @@
     <w:p>
       <w:pPr>
         <w:pStyle w:val="Heading1"/>
-        <w:spacing w:after="140" w:before="320"/>
+        <w:spacing w:before="320" w:after="140"/>
       </w:pPr>
       <w:r>
         <w:rPr>
@@ -913,7 +1004,7 @@
           <w:sz w:val="28"/>
           <w:szCs w:val="28"/>
         </w:rPr>
-        <w:t xml:space="preserve">3. Client-Feedback-Driven Changes</w:t>
+        <w:t>3. Client-Feedback-Driven Changes</w:t>
       </w:r>
     </w:p>
     <w:p>
@@ -925,7 +1016,7 @@
           <w:sz w:val="21"/>
           <w:szCs w:val="21"/>
         </w:rPr>
-        <w:t xml:space="preserve">These three fields on Assign Task were added specifically in response to client feedback from the 23 September Team A/B meeting, confirmed in scope by the PM, and carried into the approved design before DEV built them. All three are visible, working, and in the correct place in the implementation comparison above (2.4).</w:t>
+        <w:t>These three fields on Assign Task were added specifically in response to client feedback from the 23 September Team A/B meeting, confirmed in scope by the PM, and carried into the approved design before DEV built them. All three are visible, working, and in the correct place in the implementation comparison above (2.4).</w:t>
       </w:r>
     </w:p>
     <w:p>
@@ -942,7 +1033,7 @@
           <w:sz w:val="21"/>
           <w:szCs w:val="21"/>
         </w:rPr>
-        <w:t xml:space="preserve">Reference file attachment — client-requested (23 Sept meeting), confirmed by PM as current Sprint 2 scope. A simple attachment within the task content area, not a rich-text editor — matches what was agreed, not an over-built version of it.</w:t>
+        <w:t>Reference file attachment — client-requested (23 Sept meeting), confirmed by PM as current Sprint 2 scope. A simple attachment within the task content area, not a rich-text editor — matches what was agreed, not an over-built version of it.</w:t>
       </w:r>
     </w:p>
     <w:p>
@@ -959,7 +1050,23 @@
           <w:sz w:val="21"/>
           <w:szCs w:val="21"/>
         </w:rPr>
-        <w:t xml:space="preserve">Priority field — added per client feedback (Jerose), adopted by Team B for the Core MVP.</w:t>
+        <w:t>Priority field — added per client feedback (</w:t>
+      </w:r>
+      <w:proofErr w:type="spellStart"/>
+      <w:r>
+        <w:rPr>
+          <w:sz w:val="21"/>
+          <w:szCs w:val="21"/>
+        </w:rPr>
+        <w:t>Jerose</w:t>
+      </w:r>
+      <w:proofErr w:type="spellEnd"/>
+      <w:r>
+        <w:rPr>
+          <w:sz w:val="21"/>
+          <w:szCs w:val="21"/>
+        </w:rPr>
+        <w:t>), adopted by Team B for the Core MVP.</w:t>
       </w:r>
     </w:p>
     <w:p>
@@ -976,7 +1083,7 @@
           <w:sz w:val="21"/>
           <w:szCs w:val="21"/>
         </w:rPr>
-        <w:t xml:space="preserve">Assigned By field — auto-filled with the current Mentor rather than a separate entry field, consistent with the system's existing Mentor–Intern relationship (WA-04).</w:t>
+        <w:t>Assigned By field — auto-filled with the current Mentor rather than a separate entry field, consistent with the system's existing Mentor–Intern relationship (WA-04).</w:t>
       </w:r>
     </w:p>
     <w:p>
@@ -988,13 +1095,13 @@
           <w:sz w:val="21"/>
           <w:szCs w:val="21"/>
         </w:rPr>
-        <w:t xml:space="preserve">The Mentor reference attachment is also visible to the Intern on their own Task Detail screen (2.2) — DEV correctly carried the attachment through to the Intern's side of the flow, which the original design annotation implied but didn't explicitly mock as a separate screen.</w:t>
+        <w:t>The Mentor reference attachment is also visible to the Intern on their own Task Detail screen (2.2) — DEV correctly carried the attachment through to the Intern's side of the flow, which the original design annotation implied but didn't explicitly mock as a separate screen.</w:t>
       </w:r>
     </w:p>
     <w:p>
       <w:pPr>
         <w:pStyle w:val="Heading1"/>
-        <w:spacing w:after="140" w:before="320"/>
+        <w:spacing w:before="320" w:after="140"/>
       </w:pPr>
       <w:r>
         <w:rPr>
@@ -1004,7 +1111,7 @@
           <w:sz w:val="28"/>
           <w:szCs w:val="28"/>
         </w:rPr>
-        <w:t xml:space="preserve">4. Intern / Mentor Summary</w:t>
+        <w:t>4. Intern / Mentor Summary</w:t>
       </w:r>
     </w:p>
     <w:p>
@@ -1016,7 +1123,7 @@
           <w:sz w:val="21"/>
           <w:szCs w:val="21"/>
         </w:rPr>
-        <w:t xml:space="preserve">Intern experience: a scoped, single-purpose workspace — My Tasks (visibility limited to their own assigned work, AC-02.1), Task Detail with the confirmed forward-only status lifecycle (Assigned → In Progress → Submitted → Completed, no skipping or reversal), and a once-per-week Weekly Progress form that locks after submission.</w:t>
+        <w:t>Intern experience: a scoped, single-purpose workspace — My Tasks (visibility limited to their own assigned work, AC-02.1), Task Detail with the confirmed forward-only status lifecycle (Assigned → In Progress → Submitted → Completed, no skipping or reversal), and a once-per-week Weekly Progress form that locks after submission.</w:t>
       </w:r>
     </w:p>
     <w:p>
@@ -1028,13 +1135,13 @@
           <w:sz w:val="21"/>
           <w:szCs w:val="21"/>
         </w:rPr>
-        <w:t xml:space="preserve">Mentor experience: Assign Task carries the three client-requested fields above, scoped to that Mentor's permitted Interns only (VAL-03). Review Progress lets the Mentor review a Task Submission and mark it Completed, and review Weekly Progress per Intern — all confirmed, unchanged by this evidence task.</w:t>
+        <w:t>Mentor experience: Assign Task carries the three client-requested fields above, scoped to that Mentor's permitted Interns only (VAL-03). Review Progress lets the Mentor review a Task Submission and mark it Completed, and review Weekly Progress per Intern — all confirmed, unchanged by this evidence task.</w:t>
       </w:r>
     </w:p>
     <w:p>
       <w:pPr>
         <w:pStyle w:val="Heading1"/>
-        <w:spacing w:after="140" w:before="320"/>
+        <w:spacing w:before="320" w:after="140"/>
       </w:pPr>
       <w:r>
         <w:rPr>
@@ -1044,7 +1151,7 @@
           <w:sz w:val="28"/>
           <w:szCs w:val="28"/>
         </w:rPr>
-        <w:t xml:space="preserve">5. Lifecycle States (Fallback Evidence)</w:t>
+        <w:t>5. Lifecycle States (Fallback Evidence)</w:t>
       </w:r>
     </w:p>
     <w:p>
@@ -1056,7 +1163,24 @@
           <w:sz w:val="21"/>
           <w:szCs w:val="21"/>
         </w:rPr>
-        <w:t xml:space="preserve">Captured on the design side across the full confirmed status lifecycle, so the PM has a fallback if the live DEV demo can't show every transition in the room. DEV's current build only has an Assigned-state task on record at time of capture (2.2, repeated below for a complete set); these design-side states show the same lifecycle the implementation already enforces, verified earlier this sprint by running the prototype end-to-end with no console or page errors.</w:t>
+        <w:lastRenderedPageBreak/>
+        <w:t xml:space="preserve">Captured on the design side across the full confirmed status lifecycle, so the PM has a fallback if the live DEV demo can't show every transition in the room. DEV's current build only has an Assigned-state task on record at time of capture (2.2, repeated below for a complete set); these design-side states show the same lifecycle the implementation already enforces, verified earlier this </w:t>
+      </w:r>
+      <w:proofErr w:type="spellStart"/>
+      <w:r>
+        <w:rPr>
+          <w:sz w:val="21"/>
+          <w:szCs w:val="21"/>
+        </w:rPr>
+        <w:t>sprint</w:t>
+      </w:r>
+      <w:proofErr w:type="spellEnd"/>
+      <w:r>
+        <w:rPr>
+          <w:sz w:val="21"/>
+          <w:szCs w:val="21"/>
+        </w:rPr>
+        <w:t xml:space="preserve"> by running the prototype end-to-end with no console or page errors.</w:t>
       </w:r>
     </w:p>
     <w:p>
@@ -1066,11 +1190,14 @@
         <w:jc w:val="center"/>
       </w:pPr>
       <w:r>
+        <w:rPr>
+          <w:noProof/>
+        </w:rPr>
         <w:drawing>
-          <wp:inline distT="0" distB="0" distL="0" distR="0">
+          <wp:inline distT="0" distB="0" distL="0" distR="0" wp14:anchorId="0EB5C3BA" wp14:editId="6E2275BB">
             <wp:extent cx="5334000" cy="3810000"/>
-            <wp:effectExtent t="0" r="0" b="0" l="0"/>
-            <wp:docPr id="1" name="" descr="" title=""/>
+            <wp:effectExtent l="0" t="0" r="0" b="0"/>
+            <wp:docPr id="1030266823" name="Picture 1030266823"/>
             <wp:cNvGraphicFramePr>
               <a:graphicFrameLocks xmlns:a="http://schemas.openxmlformats.org/drawingml/2006/main" noChangeAspect="1"/>
             </wp:cNvGraphicFramePr>
@@ -1078,13 +1205,13 @@
               <a:graphicData uri="http://schemas.openxmlformats.org/drawingml/2006/picture">
                 <pic:pic xmlns:pic="http://schemas.openxmlformats.org/drawingml/2006/picture">
                   <pic:nvPicPr>
-                    <pic:cNvPr id="0" name="" descr=""/>
+                    <pic:cNvPr id="0" name=""/>
                     <pic:cNvPicPr>
                       <a:picLocks noChangeAspect="1" noChangeArrowheads="1"/>
                     </pic:cNvPicPr>
                   </pic:nvPicPr>
                   <pic:blipFill>
-                    <a:blip r:embed="rId9" cstate="none"/>
+                    <a:blip r:embed="rId7"/>
                     <a:srcRect/>
                     <a:stretch>
                       <a:fillRect/>
@@ -1120,7 +1247,7 @@
           <w:sz w:val="18"/>
           <w:szCs w:val="18"/>
         </w:rPr>
-        <w:t xml:space="preserve">Assigned — Intern view, starting state (matches DEV, Section 2.2)</w:t>
+        <w:t>Assigned — Intern view, starting state (matches DEV, Section 2.2)</w:t>
       </w:r>
     </w:p>
     <w:p>
@@ -1130,11 +1257,15 @@
         <w:jc w:val="center"/>
       </w:pPr>
       <w:r>
+        <w:rPr>
+          <w:noProof/>
+        </w:rPr>
+        <w:lastRenderedPageBreak/>
         <w:drawing>
-          <wp:inline distT="0" distB="0" distL="0" distR="0">
+          <wp:inline distT="0" distB="0" distL="0" distR="0" wp14:anchorId="3B0B8BDB" wp14:editId="45013364">
             <wp:extent cx="5334000" cy="5629275"/>
-            <wp:effectExtent t="0" r="0" b="0" l="0"/>
-            <wp:docPr id="1" name="" descr="" title=""/>
+            <wp:effectExtent l="0" t="0" r="0" b="0"/>
+            <wp:docPr id="1944371101" name="Picture 1944371101"/>
             <wp:cNvGraphicFramePr>
               <a:graphicFrameLocks xmlns:a="http://schemas.openxmlformats.org/drawingml/2006/main" noChangeAspect="1"/>
             </wp:cNvGraphicFramePr>
@@ -1142,13 +1273,13 @@
               <a:graphicData uri="http://schemas.openxmlformats.org/drawingml/2006/picture">
                 <pic:pic xmlns:pic="http://schemas.openxmlformats.org/drawingml/2006/picture">
                   <pic:nvPicPr>
-                    <pic:cNvPr id="0" name="" descr=""/>
+                    <pic:cNvPr id="0" name=""/>
                     <pic:cNvPicPr>
                       <a:picLocks noChangeAspect="1" noChangeArrowheads="1"/>
                     </pic:cNvPicPr>
                   </pic:nvPicPr>
                   <pic:blipFill>
-                    <a:blip r:embed="rId15" cstate="none"/>
+                    <a:blip r:embed="rId13"/>
                     <a:srcRect/>
                     <a:stretch>
                       <a:fillRect/>
@@ -1184,7 +1315,7 @@
           <w:sz w:val="18"/>
           <w:szCs w:val="18"/>
         </w:rPr>
-        <w:t xml:space="preserve">In Progress — Intern view, after “Start task”</w:t>
+        <w:t>In Progress — Intern view, after “Start task”</w:t>
       </w:r>
     </w:p>
     <w:p>
@@ -1194,11 +1325,15 @@
         <w:jc w:val="center"/>
       </w:pPr>
       <w:r>
+        <w:rPr>
+          <w:noProof/>
+        </w:rPr>
+        <w:lastRenderedPageBreak/>
         <w:drawing>
-          <wp:inline distT="0" distB="0" distL="0" distR="0">
+          <wp:inline distT="0" distB="0" distL="0" distR="0" wp14:anchorId="5A1D4D35" wp14:editId="3127C7D7">
             <wp:extent cx="5334000" cy="5629275"/>
-            <wp:effectExtent t="0" r="0" b="0" l="0"/>
-            <wp:docPr id="1" name="" descr="" title=""/>
+            <wp:effectExtent l="0" t="0" r="0" b="0"/>
+            <wp:docPr id="604290252" name="Picture 604290252"/>
             <wp:cNvGraphicFramePr>
               <a:graphicFrameLocks xmlns:a="http://schemas.openxmlformats.org/drawingml/2006/main" noChangeAspect="1"/>
             </wp:cNvGraphicFramePr>
@@ -1206,13 +1341,13 @@
               <a:graphicData uri="http://schemas.openxmlformats.org/drawingml/2006/picture">
                 <pic:pic xmlns:pic="http://schemas.openxmlformats.org/drawingml/2006/picture">
                   <pic:nvPicPr>
-                    <pic:cNvPr id="0" name="" descr=""/>
+                    <pic:cNvPr id="0" name=""/>
                     <pic:cNvPicPr>
                       <a:picLocks noChangeAspect="1" noChangeArrowheads="1"/>
                     </pic:cNvPicPr>
                   </pic:nvPicPr>
                   <pic:blipFill>
-                    <a:blip r:embed="rId16" cstate="none"/>
+                    <a:blip r:embed="rId14"/>
                     <a:srcRect/>
                     <a:stretch>
                       <a:fillRect/>
@@ -1248,7 +1383,7 @@
           <w:sz w:val="18"/>
           <w:szCs w:val="18"/>
         </w:rPr>
-        <w:t xml:space="preserve">Submitted — Intern view, after completing the Task Submission form</w:t>
+        <w:t>Submitted — Intern view, after completing the Task Submission form</w:t>
       </w:r>
     </w:p>
     <w:p>
@@ -1258,11 +1393,15 @@
         <w:jc w:val="center"/>
       </w:pPr>
       <w:r>
+        <w:rPr>
+          <w:noProof/>
+        </w:rPr>
+        <w:lastRenderedPageBreak/>
         <w:drawing>
-          <wp:inline distT="0" distB="0" distL="0" distR="0">
+          <wp:inline distT="0" distB="0" distL="0" distR="0" wp14:anchorId="5E2A57EC" wp14:editId="197BEA41">
             <wp:extent cx="5334000" cy="5629275"/>
-            <wp:effectExtent t="0" r="0" b="0" l="0"/>
-            <wp:docPr id="1" name="" descr="" title=""/>
+            <wp:effectExtent l="0" t="0" r="0" b="0"/>
+            <wp:docPr id="982398400" name="Picture 982398400"/>
             <wp:cNvGraphicFramePr>
               <a:graphicFrameLocks xmlns:a="http://schemas.openxmlformats.org/drawingml/2006/main" noChangeAspect="1"/>
             </wp:cNvGraphicFramePr>
@@ -1270,13 +1409,13 @@
               <a:graphicData uri="http://schemas.openxmlformats.org/drawingml/2006/picture">
                 <pic:pic xmlns:pic="http://schemas.openxmlformats.org/drawingml/2006/picture">
                   <pic:nvPicPr>
-                    <pic:cNvPr id="0" name="" descr=""/>
+                    <pic:cNvPr id="0" name=""/>
                     <pic:cNvPicPr>
                       <a:picLocks noChangeAspect="1" noChangeArrowheads="1"/>
                     </pic:cNvPicPr>
                   </pic:nvPicPr>
                   <pic:blipFill>
-                    <a:blip r:embed="rId17" cstate="none"/>
+                    <a:blip r:embed="rId15"/>
                     <a:srcRect/>
                     <a:stretch>
                       <a:fillRect/>
@@ -1312,7 +1451,7 @@
           <w:sz w:val="18"/>
           <w:szCs w:val="18"/>
         </w:rPr>
-        <w:t xml:space="preserve">Submitted — Mentor's Review Progress view, ready to confirm Completed</w:t>
+        <w:t>Submitted — Mentor's Review Progress view, ready to confirm Completed</w:t>
       </w:r>
     </w:p>
     <w:p>
@@ -1322,11 +1461,15 @@
         <w:jc w:val="center"/>
       </w:pPr>
       <w:r>
+        <w:rPr>
+          <w:noProof/>
+        </w:rPr>
+        <w:lastRenderedPageBreak/>
         <w:drawing>
-          <wp:inline distT="0" distB="0" distL="0" distR="0">
+          <wp:inline distT="0" distB="0" distL="0" distR="0" wp14:anchorId="41D67A35" wp14:editId="5C1B1EBD">
             <wp:extent cx="5334000" cy="5657850"/>
-            <wp:effectExtent t="0" r="0" b="0" l="0"/>
-            <wp:docPr id="1" name="" descr="" title=""/>
+            <wp:effectExtent l="0" t="0" r="0" b="0"/>
+            <wp:docPr id="758897283" name="Picture 758897283"/>
             <wp:cNvGraphicFramePr>
               <a:graphicFrameLocks xmlns:a="http://schemas.openxmlformats.org/drawingml/2006/main" noChangeAspect="1"/>
             </wp:cNvGraphicFramePr>
@@ -1334,13 +1477,13 @@
               <a:graphicData uri="http://schemas.openxmlformats.org/drawingml/2006/picture">
                 <pic:pic xmlns:pic="http://schemas.openxmlformats.org/drawingml/2006/picture">
                   <pic:nvPicPr>
-                    <pic:cNvPr id="0" name="" descr=""/>
+                    <pic:cNvPr id="0" name=""/>
                     <pic:cNvPicPr>
                       <a:picLocks noChangeAspect="1" noChangeArrowheads="1"/>
                     </pic:cNvPicPr>
                   </pic:nvPicPr>
                   <pic:blipFill>
-                    <a:blip r:embed="rId18" cstate="none"/>
+                    <a:blip r:embed="rId16"/>
                     <a:srcRect/>
                     <a:stretch>
                       <a:fillRect/>
@@ -1376,13 +1519,13 @@
           <w:sz w:val="18"/>
           <w:szCs w:val="18"/>
         </w:rPr>
-        <w:t xml:space="preserve">Completed — Mentor view, after “Mark completed”; submitted work stays visible</w:t>
+        <w:t>Completed — Mentor view, after “Mark completed”; submitted work stays visible</w:t>
       </w:r>
     </w:p>
     <w:p>
       <w:pPr>
         <w:pStyle w:val="Heading1"/>
-        <w:spacing w:after="140" w:before="320"/>
+        <w:spacing w:before="320" w:after="140"/>
       </w:pPr>
       <w:r>
         <w:rPr>
@@ -1392,40 +1535,51 @@
           <w:sz w:val="28"/>
           <w:szCs w:val="28"/>
         </w:rPr>
-        <w:t xml:space="preserve">6. Fallback Demo Evidence &amp; Figma</w:t>
+        <w:t>6. Fallback Demo Evidence &amp; Figma</w:t>
       </w:r>
     </w:p>
     <w:tbl>
       <w:tblPr>
-        <w:tblW w:type="pct" w:w="100%"/>
+        <w:tblW w:w="5000" w:type="pct"/>
         <w:tblBorders>
-          <w:top w:val="single" w:color="auto" w:sz="4"/>
-          <w:left w:val="single" w:color="auto" w:sz="4"/>
-          <w:bottom w:val="single" w:color="auto" w:sz="4"/>
-          <w:right w:val="single" w:color="auto" w:sz="4"/>
-          <w:insideH w:val="single" w:color="auto" w:sz="4"/>
-          <w:insideV w:val="single" w:color="auto" w:sz="4"/>
+          <w:top w:val="single" w:sz="4" w:space="0" w:color="auto"/>
+          <w:left w:val="single" w:sz="4" w:space="0" w:color="auto"/>
+          <w:bottom w:val="single" w:sz="4" w:space="0" w:color="auto"/>
+          <w:right w:val="single" w:sz="4" w:space="0" w:color="auto"/>
+          <w:insideH w:val="single" w:sz="4" w:space="0" w:color="auto"/>
+          <w:insideV w:val="single" w:sz="4" w:space="0" w:color="auto"/>
         </w:tblBorders>
+        <w:tblCellMar>
+          <w:left w:w="10" w:type="dxa"/>
+          <w:right w:w="10" w:type="dxa"/>
+        </w:tblCellMar>
+        <w:tblLook w:val="0000" w:firstRow="0" w:lastRow="0" w:firstColumn="0" w:lastColumn="0" w:noHBand="0" w:noVBand="0"/>
       </w:tblPr>
       <w:tblGrid>
-        <w:gridCol w:w="100"/>
+        <w:gridCol w:w="9350"/>
       </w:tblGrid>
       <w:tr>
+        <w:tblPrEx>
+          <w:tblCellMar>
+            <w:top w:w="0" w:type="dxa"/>
+            <w:bottom w:w="0" w:type="dxa"/>
+          </w:tblCellMar>
+        </w:tblPrEx>
         <w:tc>
           <w:tcPr>
-            <w:tcW w:type="pct" w:w="100%"/>
+            <w:tcW w:w="5000" w:type="pct"/>
             <w:tcBorders>
-              <w:top w:val="single" w:color="B45309" w:sz="4"/>
-              <w:left w:val="single" w:color="B45309" w:sz="4"/>
-              <w:bottom w:val="single" w:color="B45309" w:sz="4"/>
-              <w:right w:val="single" w:color="B45309" w:sz="4"/>
+              <w:top w:val="single" w:sz="4" w:space="0" w:color="B45309"/>
+              <w:left w:val="single" w:sz="4" w:space="0" w:color="B45309"/>
+              <w:bottom w:val="single" w:sz="4" w:space="0" w:color="B45309"/>
+              <w:right w:val="single" w:sz="4" w:space="0" w:color="B45309"/>
             </w:tcBorders>
-            <w:shd w:fill="FFFBEB" w:val="clear"/>
+            <w:shd w:val="clear" w:color="auto" w:fill="FFFBEB"/>
             <w:tcMar>
-              <w:top w:type="dxa" w:w="120"/>
-              <w:left w:type="dxa" w:w="160"/>
-              <w:bottom w:type="dxa" w:w="120"/>
-              <w:right w:type="dxa" w:w="160"/>
+              <w:top w:w="120" w:type="dxa"/>
+              <w:left w:w="160" w:type="dxa"/>
+              <w:bottom w:w="120" w:type="dxa"/>
+              <w:right w:w="160" w:type="dxa"/>
             </w:tcMar>
           </w:tcPr>
           <w:p>
@@ -1437,20 +1591,19 @@
                 <w:b/>
                 <w:bCs/>
                 <w:color w:val="B45309"/>
-                <w:sz w:val="20"/>
-                <w:szCs w:val="20"/>
               </w:rPr>
-              <w:t xml:space="preserve">Figma link</w:t>
+              <w:t>Figma link</w:t>
             </w:r>
           </w:p>
           <w:p>
-            <w:r>
-              <w:rPr>
-                <w:sz w:val="20"/>
-                <w:szCs w:val="20"/>
-              </w:rPr>
-              <w:t xml:space="preserve">[PASTE FIGMA MAKE LINK HERE — Freddie to add before handoff]</w:t>
-            </w:r>
+            <w:hyperlink r:id="rId17" w:history="1">
+              <w:r>
+                <w:rPr>
+                  <w:rStyle w:val="Hyperlink"/>
+                </w:rPr>
+                <w:t>Mentor task Assignment prototype – Figma Make</w:t>
+              </w:r>
+            </w:hyperlink>
           </w:p>
         </w:tc>
       </w:tr>
@@ -1469,13 +1622,13 @@
           <w:sz w:val="21"/>
           <w:szCs w:val="21"/>
         </w:rPr>
-        <w:t xml:space="preserve">This document itself is the fallback visual evidence required by the task: every comparison above is a real screenshot, not a mock-up, of both the approved design and DEV's live implementation, captured in the relevant logged-in role. If the live demo environment is unavailable during Playback, the PM can present directly from Section 2.</w:t>
+        <w:t>This document itself is the fallback visual evidence required by the task: every comparison above is a real screenshot, not a mock-up, of both the approved design and DEV's live implementation, captured in the relevant logged-in role. If the live demo environment is unavailable during Playback, the PM can present directly from Section 2.</w:t>
       </w:r>
     </w:p>
     <w:p>
       <w:pPr>
         <w:pStyle w:val="Heading1"/>
-        <w:spacing w:after="140" w:before="320"/>
+        <w:spacing w:before="320" w:after="140"/>
       </w:pPr>
       <w:r>
         <w:rPr>
@@ -1485,40 +1638,51 @@
           <w:sz w:val="28"/>
           <w:szCs w:val="28"/>
         </w:rPr>
-        <w:t xml:space="preserve">7. Handoff Summary</w:t>
+        <w:t>7. Handoff Summary</w:t>
       </w:r>
     </w:p>
     <w:tbl>
       <w:tblPr>
-        <w:tblW w:type="pct" w:w="100%"/>
+        <w:tblW w:w="5000" w:type="pct"/>
         <w:tblBorders>
-          <w:top w:val="single" w:color="auto" w:sz="4"/>
-          <w:left w:val="single" w:color="auto" w:sz="4"/>
-          <w:bottom w:val="single" w:color="auto" w:sz="4"/>
-          <w:right w:val="single" w:color="auto" w:sz="4"/>
-          <w:insideH w:val="single" w:color="auto" w:sz="4"/>
-          <w:insideV w:val="single" w:color="auto" w:sz="4"/>
+          <w:top w:val="single" w:sz="4" w:space="0" w:color="auto"/>
+          <w:left w:val="single" w:sz="4" w:space="0" w:color="auto"/>
+          <w:bottom w:val="single" w:sz="4" w:space="0" w:color="auto"/>
+          <w:right w:val="single" w:sz="4" w:space="0" w:color="auto"/>
+          <w:insideH w:val="single" w:sz="4" w:space="0" w:color="auto"/>
+          <w:insideV w:val="single" w:sz="4" w:space="0" w:color="auto"/>
         </w:tblBorders>
+        <w:tblCellMar>
+          <w:left w:w="10" w:type="dxa"/>
+          <w:right w:w="10" w:type="dxa"/>
+        </w:tblCellMar>
+        <w:tblLook w:val="0000" w:firstRow="0" w:lastRow="0" w:firstColumn="0" w:lastColumn="0" w:noHBand="0" w:noVBand="0"/>
       </w:tblPr>
       <w:tblGrid>
-        <w:gridCol w:w="100"/>
+        <w:gridCol w:w="9350"/>
       </w:tblGrid>
       <w:tr>
+        <w:tblPrEx>
+          <w:tblCellMar>
+            <w:top w:w="0" w:type="dxa"/>
+            <w:bottom w:w="0" w:type="dxa"/>
+          </w:tblCellMar>
+        </w:tblPrEx>
         <w:tc>
           <w:tcPr>
-            <w:tcW w:type="pct" w:w="100%"/>
+            <w:tcW w:w="5000" w:type="pct"/>
             <w:tcBorders>
-              <w:top w:val="single" w:color="15803D" w:sz="4"/>
-              <w:left w:val="single" w:color="15803D" w:sz="4"/>
-              <w:bottom w:val="single" w:color="15803D" w:sz="4"/>
-              <w:right w:val="single" w:color="15803D" w:sz="4"/>
+              <w:top w:val="single" w:sz="4" w:space="0" w:color="15803D"/>
+              <w:left w:val="single" w:sz="4" w:space="0" w:color="15803D"/>
+              <w:bottom w:val="single" w:sz="4" w:space="0" w:color="15803D"/>
+              <w:right w:val="single" w:sz="4" w:space="0" w:color="15803D"/>
             </w:tcBorders>
-            <w:shd w:fill="F0FDF4" w:val="clear"/>
+            <w:shd w:val="clear" w:color="auto" w:fill="F0FDF4"/>
             <w:tcMar>
-              <w:top w:type="dxa" w:w="120"/>
-              <w:left w:type="dxa" w:w="160"/>
-              <w:bottom w:type="dxa" w:w="120"/>
-              <w:right w:type="dxa" w:w="160"/>
+              <w:top w:w="120" w:type="dxa"/>
+              <w:left w:w="160" w:type="dxa"/>
+              <w:bottom w:w="120" w:type="dxa"/>
+              <w:right w:w="160" w:type="dxa"/>
             </w:tcMar>
           </w:tcPr>
           <w:p>
@@ -1530,19 +1694,27 @@
                 <w:b/>
                 <w:bCs/>
                 <w:color w:val="15803D"/>
-                <w:sz w:val="20"/>
-                <w:szCs w:val="20"/>
               </w:rPr>
-              <w:t xml:space="preserve">Confirmed</w:t>
+              <w:lastRenderedPageBreak/>
+              <w:t>Confirmed</w:t>
             </w:r>
           </w:p>
           <w:p>
             <w:r>
-              <w:rPr>
-                <w:sz w:val="20"/>
-                <w:szCs w:val="20"/>
-              </w:rPr>
-              <w:t xml:space="preserve">Four design→implementation comparisons captured and verified against the current DEV deployment. All three client-feedback-driven changes (Section 3) are implemented, visible, and in the correct place. Fallback lifecycle evidence (Section 5) is ready in case the live demo is unavailable.</w:t>
+              <w:t xml:space="preserve">Four </w:t>
+            </w:r>
+            <w:proofErr w:type="spellStart"/>
+            <w:proofErr w:type="gramStart"/>
+            <w:r>
+              <w:t>design</w:t>
+            </w:r>
+            <w:proofErr w:type="gramEnd"/>
+            <w:r>
+              <w:t>→implementation</w:t>
+            </w:r>
+            <w:proofErr w:type="spellEnd"/>
+            <w:r>
+              <w:t xml:space="preserve"> comparisons captured and verified against the current DEV deployment. All three client-feedback-driven changes (Section 3) are implemented, visible, and in the correct place. Fallback lifecycle evidence (Section 5) is ready in case the live demo is unavailable.</w:t>
             </w:r>
           </w:p>
         </w:tc>
@@ -1555,35 +1727,46 @@
     </w:p>
     <w:tbl>
       <w:tblPr>
-        <w:tblW w:type="pct" w:w="100%"/>
+        <w:tblW w:w="5000" w:type="pct"/>
         <w:tblBorders>
-          <w:top w:val="single" w:color="auto" w:sz="4"/>
-          <w:left w:val="single" w:color="auto" w:sz="4"/>
-          <w:bottom w:val="single" w:color="auto" w:sz="4"/>
-          <w:right w:val="single" w:color="auto" w:sz="4"/>
-          <w:insideH w:val="single" w:color="auto" w:sz="4"/>
-          <w:insideV w:val="single" w:color="auto" w:sz="4"/>
+          <w:top w:val="single" w:sz="4" w:space="0" w:color="auto"/>
+          <w:left w:val="single" w:sz="4" w:space="0" w:color="auto"/>
+          <w:bottom w:val="single" w:sz="4" w:space="0" w:color="auto"/>
+          <w:right w:val="single" w:sz="4" w:space="0" w:color="auto"/>
+          <w:insideH w:val="single" w:sz="4" w:space="0" w:color="auto"/>
+          <w:insideV w:val="single" w:sz="4" w:space="0" w:color="auto"/>
         </w:tblBorders>
+        <w:tblCellMar>
+          <w:left w:w="10" w:type="dxa"/>
+          <w:right w:w="10" w:type="dxa"/>
+        </w:tblCellMar>
+        <w:tblLook w:val="0000" w:firstRow="0" w:lastRow="0" w:firstColumn="0" w:lastColumn="0" w:noHBand="0" w:noVBand="0"/>
       </w:tblPr>
       <w:tblGrid>
-        <w:gridCol w:w="100"/>
+        <w:gridCol w:w="9350"/>
       </w:tblGrid>
       <w:tr>
+        <w:tblPrEx>
+          <w:tblCellMar>
+            <w:top w:w="0" w:type="dxa"/>
+            <w:bottom w:w="0" w:type="dxa"/>
+          </w:tblCellMar>
+        </w:tblPrEx>
         <w:tc>
           <w:tcPr>
-            <w:tcW w:type="pct" w:w="100%"/>
+            <w:tcW w:w="5000" w:type="pct"/>
             <w:tcBorders>
-              <w:top w:val="single" w:color="B45309" w:sz="4"/>
-              <w:left w:val="single" w:color="B45309" w:sz="4"/>
-              <w:bottom w:val="single" w:color="B45309" w:sz="4"/>
-              <w:right w:val="single" w:color="B45309" w:sz="4"/>
+              <w:top w:val="single" w:sz="4" w:space="0" w:color="B45309"/>
+              <w:left w:val="single" w:sz="4" w:space="0" w:color="B45309"/>
+              <w:bottom w:val="single" w:sz="4" w:space="0" w:color="B45309"/>
+              <w:right w:val="single" w:sz="4" w:space="0" w:color="B45309"/>
             </w:tcBorders>
-            <w:shd w:fill="FFFBEB" w:val="clear"/>
+            <w:shd w:val="clear" w:color="auto" w:fill="FFFBEB"/>
             <w:tcMar>
-              <w:top w:type="dxa" w:w="120"/>
-              <w:left w:type="dxa" w:w="160"/>
-              <w:bottom w:type="dxa" w:w="120"/>
-              <w:right w:type="dxa" w:w="160"/>
+              <w:top w:w="120" w:type="dxa"/>
+              <w:left w:w="160" w:type="dxa"/>
+              <w:bottom w:w="120" w:type="dxa"/>
+              <w:right w:w="160" w:type="dxa"/>
             </w:tcMar>
           </w:tcPr>
           <w:p>
@@ -1595,19 +1778,13 @@
                 <w:b/>
                 <w:bCs/>
                 <w:color w:val="B45309"/>
-                <w:sz w:val="20"/>
-                <w:szCs w:val="20"/>
               </w:rPr>
-              <w:t xml:space="preserve">Open before Playback</w:t>
+              <w:t>Open before Playback</w:t>
             </w:r>
           </w:p>
           <w:p>
             <w:r>
-              <w:rPr>
-                <w:sz w:val="20"/>
-                <w:szCs w:val="20"/>
-              </w:rPr>
-              <w:t xml:space="preserve">Figma Make link needs to be pasted into Section 6. DEV's live record only shows an Assigned-state task at time of capture — if the PM wants a live Submitted/Completed transition in the room, that needs a quick DEV-side run-through before rehearsal, otherwise present from the Section 5 fallback evidence instead.</w:t>
+              <w:t>Figma Make link needs to be pasted into Section 6. DEV's live record only shows an Assigned-state task at time of capture — if the PM wants a live Submitted/Completed transition in the room, that needs a quick DEV-side run-through before rehearsal, otherwise present from the Section 5 fallback evidence instead.</w:t>
             </w:r>
           </w:p>
         </w:tc>
@@ -1627,102 +1804,74 @@
           <w:sz w:val="21"/>
           <w:szCs w:val="21"/>
         </w:rPr>
-        <w:t xml:space="preserve">Files: App.tsx (v5) — core-mvp-prototype; DEV screenshots captured live from the Vercel deployment, logged in as Mentor/Intern. Handed off to PM ahead of Sprint 2 Playback rehearsal.</w:t>
+        <w:t xml:space="preserve">Files: </w:t>
+      </w:r>
+      <w:proofErr w:type="spellStart"/>
+      <w:r>
+        <w:rPr>
+          <w:sz w:val="21"/>
+          <w:szCs w:val="21"/>
+        </w:rPr>
+        <w:t>App.tsx</w:t>
+      </w:r>
+      <w:proofErr w:type="spellEnd"/>
+      <w:r>
+        <w:rPr>
+          <w:sz w:val="21"/>
+          <w:szCs w:val="21"/>
+        </w:rPr>
+        <w:t xml:space="preserve"> (v5) — core-</w:t>
+      </w:r>
+      <w:proofErr w:type="spellStart"/>
+      <w:r>
+        <w:rPr>
+          <w:sz w:val="21"/>
+          <w:szCs w:val="21"/>
+        </w:rPr>
+        <w:t>mvp</w:t>
+      </w:r>
+      <w:proofErr w:type="spellEnd"/>
+      <w:r>
+        <w:rPr>
+          <w:sz w:val="21"/>
+          <w:szCs w:val="21"/>
+        </w:rPr>
+        <w:t xml:space="preserve">-prototype; DEV screenshots captured live from the </w:t>
+      </w:r>
+      <w:proofErr w:type="spellStart"/>
+      <w:r>
+        <w:rPr>
+          <w:sz w:val="21"/>
+          <w:szCs w:val="21"/>
+        </w:rPr>
+        <w:t>Vercel</w:t>
+      </w:r>
+      <w:proofErr w:type="spellEnd"/>
+      <w:r>
+        <w:rPr>
+          <w:sz w:val="21"/>
+          <w:szCs w:val="21"/>
+        </w:rPr>
+        <w:t xml:space="preserve"> deployment, logged in as Mentor/Intern. Handed off to PM ahead of Sprint 2 Playback rehearsal.</w:t>
       </w:r>
     </w:p>
     <w:sectPr>
-      <w:pgSz w:w="12240" w:h="15840" w:orient="portrait"/>
+      <w:pgSz w:w="12240" w:h="15840"/>
       <w:pgMar w:top="1440" w:right="1440" w:bottom="1440" w:left="1440" w:header="708" w:footer="708" w:gutter="0"/>
-      <w:pgNumType/>
+      <w:cols w:space="720"/>
       <w:docGrid w:linePitch="360"/>
     </w:sectPr>
   </w:body>
 </w:document>
 </file>
 
-<file path=word/comments.xml><?xml version="1.0" encoding="utf-8"?>
-<w:comments xmlns:cx="http://schemas.microsoft.com/office/drawing/2014/chartex" xmlns:cx1="http://schemas.microsoft.com/office/drawing/2015/9/8/chartex" xmlns:cx2="http://schemas.microsoft.com/office/drawing/2015/10/21/chartex" xmlns:cx3="http://schemas.microsoft.com/office/drawing/2016/5/9/chartex" xmlns:cx4="http://schemas.microsoft.com/office/drawing/2016/5/10/chartex" xmlns:cx5="http://schemas.microsoft.com/office/drawing/2016/5/11/chartex" xmlns:cx6="http://schemas.microsoft.com/office/drawing/2016/5/12/chartex" xmlns:cx7="http://schemas.microsoft.com/office/drawing/2016/5/13/chartex" xmlns:cx8="http://schemas.microsoft.com/office/drawing/2016/5/14/chartex" xmlns:mc="http://schemas.openxmlformats.org/markup-compatibility/2006" xmlns:aink="http://schemas.microsoft.com/office/drawing/2016/ink" xmlns:am3d="http://schemas.microsoft.com/office/drawing/2017/model3d" xmlns:o="urn:schemas-microsoft-com:office:office" xmlns:r="http://schemas.openxmlformats.org/officeDocument/2006/relationships" xmlns:m="http://schemas.openxmlformats.org/officeDocument/2006/math" xmlns:v="urn:schemas-microsoft-com:vml" xmlns:wp14="http://schemas.microsoft.com/office/word/2010/wordprocessingDrawing" xmlns:wp="http://schemas.openxmlformats.org/drawingml/2006/wordprocessingDrawing" xmlns:w10="urn:schemas-microsoft-com:office:word" xmlns:w="http://schemas.openxmlformats.org/wordprocessingml/2006/main" xmlns:w14="http://schemas.microsoft.com/office/word/2010/wordml" xmlns:w15="http://schemas.microsoft.com/office/word/2012/wordml" xmlns:w16cex="http://schemas.microsoft.com/office/word/2018/wordml/cex" xmlns:w16cid="http://schemas.microsoft.com/office/word/2016/wordml/cid" xmlns:w16="http://schemas.microsoft.com/office/word/2018/wordml" xmlns:w16sdtdh="http://schemas.microsoft.com/office/word/2020/wordml/sdtdatahash" xmlns:w16se="http://schemas.microsoft.com/office/word/2015/wordml/symex" xmlns:wpg="http://schemas.microsoft.com/office/word/2010/wordprocessingGroup" xmlns:wpi="http://schemas.microsoft.com/office/word/2010/wordprocessingInk" xmlns:wne="http://schemas.microsoft.com/office/word/2006/wordml" xmlns:wps="http://schemas.microsoft.com/office/word/2010/wordprocessingShape"/>
-</file>
-
-<file path=word/endnotes.xml><?xml version="1.0" encoding="utf-8"?>
-<w:endnotes xmlns:wpc="http://schemas.microsoft.com/office/word/2010/wordprocessingCanvas" xmlns:mc="http://schemas.openxmlformats.org/markup-compatibility/2006" xmlns:o="urn:schemas-microsoft-com:office:office" xmlns:r="http://schemas.openxmlformats.org/officeDocument/2006/relationships" xmlns:m="http://schemas.openxmlformats.org/officeDocument/2006/math" xmlns:v="urn:schemas-microsoft-com:vml" xmlns:wp14="http://schemas.microsoft.com/office/word/2010/wordprocessingDrawing" xmlns:wp="http://schemas.openxmlformats.org/drawingml/2006/wordprocessingDrawing" xmlns:w10="urn:schemas-microsoft-com:office:word" xmlns:w="http://schemas.openxmlformats.org/wordprocessingml/2006/main" xmlns:w14="http://schemas.microsoft.com/office/word/2010/wordml" xmlns:w15="http://schemas.microsoft.com/office/word/2012/wordml" xmlns:wpg="http://schemas.microsoft.com/office/word/2010/wordprocessingGroup" xmlns:wpi="http://schemas.microsoft.com/office/word/2010/wordprocessingInk" xmlns:wne="http://schemas.microsoft.com/office/word/2006/wordml" xmlns:wps="http://schemas.microsoft.com/office/word/2010/wordprocessingShape" mc:Ignorable="w14 w15 wp14">
-  <w:endnote w:type="separator" w:id="-1">
-    <w:p>
-      <w:pPr>
-        <w:spacing w:after="0" w:line="240" w:lineRule="auto"/>
-      </w:pPr>
-      <w:r>
-        <w:rPr>
-          <w:rStyle w:val="EndnoteReference"/>
-        </w:rPr>
-        <w:endnoteRef/>
-      </w:r>
-      <w:r>
-        <w:separator/>
-      </w:r>
-    </w:p>
-  </w:endnote>
-  <w:endnote w:type="continuationSeparator" w:id="0">
-    <w:p>
-      <w:pPr>
-        <w:spacing w:after="0" w:line="240" w:lineRule="auto"/>
-      </w:pPr>
-      <w:r>
-        <w:rPr>
-          <w:rStyle w:val="EndnoteReference"/>
-        </w:rPr>
-        <w:endnoteRef/>
-      </w:r>
-      <w:r>
-        <w:continuationSeparator/>
-      </w:r>
-    </w:p>
-  </w:endnote>
-</w:endnotes>
-</file>
-
-<file path=word/footnotes.xml><?xml version="1.0" encoding="utf-8"?>
-<w:footnotes xmlns:wpc="http://schemas.microsoft.com/office/word/2010/wordprocessingCanvas" xmlns:mc="http://schemas.openxmlformats.org/markup-compatibility/2006" xmlns:o="urn:schemas-microsoft-com:office:office" xmlns:r="http://schemas.openxmlformats.org/officeDocument/2006/relationships" xmlns:m="http://schemas.openxmlformats.org/officeDocument/2006/math" xmlns:v="urn:schemas-microsoft-com:vml" xmlns:wp14="http://schemas.microsoft.com/office/word/2010/wordprocessingDrawing" xmlns:wp="http://schemas.openxmlformats.org/drawingml/2006/wordprocessingDrawing" xmlns:w10="urn:schemas-microsoft-com:office:word" xmlns:w="http://schemas.openxmlformats.org/wordprocessingml/2006/main" xmlns:w14="http://schemas.microsoft.com/office/word/2010/wordml" xmlns:w15="http://schemas.microsoft.com/office/word/2012/wordml" xmlns:wpg="http://schemas.microsoft.com/office/word/2010/wordprocessingGroup" xmlns:wpi="http://schemas.microsoft.com/office/word/2010/wordprocessingInk" xmlns:wne="http://schemas.microsoft.com/office/word/2006/wordml" xmlns:wps="http://schemas.microsoft.com/office/word/2010/wordprocessingShape" mc:Ignorable="w14 w15 wp14">
-  <w:footnote w:type="separator" w:id="-1">
-    <w:p>
-      <w:pPr>
-        <w:spacing w:after="0" w:line="240" w:lineRule="auto"/>
-      </w:pPr>
-      <w:r>
-        <w:rPr>
-          <w:rStyle w:val="FootnoteReference"/>
-        </w:rPr>
-        <w:footnoteRef/>
-      </w:r>
-      <w:r>
-        <w:separator/>
-      </w:r>
-    </w:p>
-  </w:footnote>
-  <w:footnote w:type="continuationSeparator" w:id="0">
-    <w:p>
-      <w:pPr>
-        <w:spacing w:after="0" w:line="240" w:lineRule="auto"/>
-      </w:pPr>
-      <w:r>
-        <w:rPr>
-          <w:rStyle w:val="FootnoteReference"/>
-        </w:rPr>
-        <w:footnoteRef/>
-      </w:r>
-      <w:r>
-        <w:continuationSeparator/>
-      </w:r>
-    </w:p>
-  </w:footnote>
-</w:footnotes>
-</file>
-
 <file path=word/numbering.xml><?xml version="1.0" encoding="utf-8"?>
-<w:numbering xmlns:wpc="http://schemas.microsoft.com/office/word/2010/wordprocessingCanvas" xmlns:mc="http://schemas.openxmlformats.org/markup-compatibility/2006" xmlns:o="urn:schemas-microsoft-com:office:office" xmlns:r="http://schemas.openxmlformats.org/officeDocument/2006/relationships" xmlns:m="http://schemas.openxmlformats.org/officeDocument/2006/math" xmlns:v="urn:schemas-microsoft-com:vml" xmlns:wp14="http://schemas.microsoft.com/office/word/2010/wordprocessingDrawing" xmlns:wp="http://schemas.openxmlformats.org/drawingml/2006/wordprocessingDrawing" xmlns:w10="urn:schemas-microsoft-com:office:word" xmlns:w="http://schemas.openxmlformats.org/wordprocessingml/2006/main" xmlns:w14="http://schemas.microsoft.com/office/word/2010/wordml" xmlns:w15="http://schemas.microsoft.com/office/word/2012/wordml" xmlns:wpg="http://schemas.microsoft.com/office/word/2010/wordprocessingGroup" xmlns:wpi="http://schemas.microsoft.com/office/word/2010/wordprocessingInk" xmlns:wne="http://schemas.microsoft.com/office/word/2006/wordml" xmlns:wps="http://schemas.microsoft.com/office/word/2010/wordprocessingShape" mc:Ignorable="w14 w15 wp14">
-  <w:abstractNum w:abstractNumId="1" w15:restartNumberingAfterBreak="0">
+<w:numbering xmlns:wpc="http://schemas.microsoft.com/office/word/2010/wordprocessingCanvas" xmlns:cx="http://schemas.microsoft.com/office/drawing/2014/chartex" xmlns:cx1="http://schemas.microsoft.com/office/drawing/2015/9/8/chartex" xmlns:cx2="http://schemas.microsoft.com/office/drawing/2015/10/21/chartex" xmlns:cx3="http://schemas.microsoft.com/office/drawing/2016/5/9/chartex" xmlns:cx4="http://schemas.microsoft.com/office/drawing/2016/5/10/chartex" xmlns:cx5="http://schemas.microsoft.com/office/drawing/2016/5/11/chartex" xmlns:cx6="http://schemas.microsoft.com/office/drawing/2016/5/12/chartex" xmlns:cx7="http://schemas.microsoft.com/office/drawing/2016/5/13/chartex" xmlns:cx8="http://schemas.microsoft.com/office/drawing/2016/5/14/chartex" xmlns:mc="http://schemas.openxmlformats.org/markup-compatibility/2006" xmlns:aink="http://schemas.microsoft.com/office/drawing/2016/ink" xmlns:am3d="http://schemas.microsoft.com/office/drawing/2017/model3d" xmlns:o="urn:schemas-microsoft-com:office:office" xmlns:oel="http://schemas.microsoft.com/office/2019/extlst" xmlns:r="http://schemas.openxmlformats.org/officeDocument/2006/relationships" xmlns:m="http://schemas.openxmlformats.org/officeDocument/2006/math" xmlns:v="urn:schemas-microsoft-com:vml" xmlns:wp14="http://schemas.microsoft.com/office/word/2010/wordprocessingDrawing" xmlns:wp="http://schemas.openxmlformats.org/drawingml/2006/wordprocessingDrawing" xmlns:w10="urn:schemas-microsoft-com:office:word" xmlns:w="http://schemas.openxmlformats.org/wordprocessingml/2006/main" xmlns:w14="http://schemas.microsoft.com/office/word/2010/wordml" xmlns:w15="http://schemas.microsoft.com/office/word/2012/wordml" xmlns:w16cex="http://schemas.microsoft.com/office/word/2018/wordml/cex" xmlns:w16cid="http://schemas.microsoft.com/office/word/2016/wordml/cid" xmlns:w16="http://schemas.microsoft.com/office/word/2018/wordml" xmlns:w16du="http://schemas.microsoft.com/office/word/2023/wordml/word16du" xmlns:w16sdtdh="http://schemas.microsoft.com/office/word/2020/wordml/sdtdatahash" xmlns:w16sdtfl="http://schemas.microsoft.com/office/word/2024/wordml/sdtformatlock" xmlns:w16se="http://schemas.microsoft.com/office/word/2015/wordml/symex" xmlns:wpg="http://schemas.microsoft.com/office/word/2010/wordprocessingGroup" xmlns:wpi="http://schemas.microsoft.com/office/word/2010/wordprocessingInk" xmlns:wne="http://schemas.microsoft.com/office/word/2006/wordml" xmlns:wps="http://schemas.microsoft.com/office/word/2010/wordprocessingShape" mc:Ignorable="w14 w15 w16se w16cid w16 w16cex w16sdtdh w16sdtfl w16du wp14">
+  <w:abstractNum w:abstractNumId="0" w15:restartNumberingAfterBreak="0">
+    <w:nsid w:val="38DE5CDB"/>
     <w:multiLevelType w:val="hybridMultilevel"/>
-    <w:lvl w:ilvl="0" w15:tentative="1">
+    <w:tmpl w:val="F766AFF2"/>
+    <w:lvl w:ilvl="0" w:tplc="4DDECF9E">
       <w:start w:val="1"/>
       <w:numFmt w:val="bullet"/>
       <w:lvlText w:val="●"/>
@@ -1731,7 +1880,7 @@
         <w:ind w:left="720" w:hanging="360"/>
       </w:pPr>
     </w:lvl>
-    <w:lvl w:ilvl="1" w15:tentative="1">
+    <w:lvl w:ilvl="1" w:tplc="67C087EC">
       <w:start w:val="1"/>
       <w:numFmt w:val="bullet"/>
       <w:lvlText w:val="○"/>
@@ -1740,7 +1889,7 @@
         <w:ind w:left="1440" w:hanging="360"/>
       </w:pPr>
     </w:lvl>
-    <w:lvl w:ilvl="2" w15:tentative="1">
+    <w:lvl w:ilvl="2" w:tplc="0014682A">
       <w:start w:val="1"/>
       <w:numFmt w:val="bullet"/>
       <w:lvlText w:val="■"/>
@@ -1749,7 +1898,7 @@
         <w:ind w:left="2160" w:hanging="360"/>
       </w:pPr>
     </w:lvl>
-    <w:lvl w:ilvl="3" w15:tentative="1">
+    <w:lvl w:ilvl="3" w:tplc="70361FA6">
       <w:start w:val="1"/>
       <w:numFmt w:val="bullet"/>
       <w:lvlText w:val="●"/>
@@ -1758,7 +1907,7 @@
         <w:ind w:left="2880" w:hanging="360"/>
       </w:pPr>
     </w:lvl>
-    <w:lvl w:ilvl="4" w15:tentative="1">
+    <w:lvl w:ilvl="4" w:tplc="95185B06">
       <w:start w:val="1"/>
       <w:numFmt w:val="bullet"/>
       <w:lvlText w:val="○"/>
@@ -1767,7 +1916,7 @@
         <w:ind w:left="3600" w:hanging="360"/>
       </w:pPr>
     </w:lvl>
-    <w:lvl w:ilvl="5" w15:tentative="1">
+    <w:lvl w:ilvl="5" w:tplc="6C429C88">
       <w:start w:val="1"/>
       <w:numFmt w:val="bullet"/>
       <w:lvlText w:val="■"/>
@@ -1776,7 +1925,7 @@
         <w:ind w:left="4320" w:hanging="360"/>
       </w:pPr>
     </w:lvl>
-    <w:lvl w:ilvl="6" w15:tentative="1">
+    <w:lvl w:ilvl="6" w:tplc="8A763638">
       <w:start w:val="1"/>
       <w:numFmt w:val="bullet"/>
       <w:lvlText w:val="●"/>
@@ -1785,7 +1934,7 @@
         <w:ind w:left="5040" w:hanging="360"/>
       </w:pPr>
     </w:lvl>
-    <w:lvl w:ilvl="7" w15:tentative="1">
+    <w:lvl w:ilvl="7" w:tplc="769EFC88">
       <w:start w:val="1"/>
       <w:numFmt w:val="bullet"/>
       <w:lvlText w:val="●"/>
@@ -1794,7 +1943,7 @@
         <w:ind w:left="5760" w:hanging="360"/>
       </w:pPr>
     </w:lvl>
-    <w:lvl w:ilvl="8" w15:tentative="1">
+    <w:lvl w:ilvl="8" w:tplc="8852290C">
       <w:start w:val="1"/>
       <w:numFmt w:val="bullet"/>
       <w:lvlText w:val="●"/>
@@ -1804,8 +1953,8 @@
       </w:pPr>
     </w:lvl>
   </w:abstractNum>
-  <w:num w:numId="1">
-    <w:abstractNumId w:val="1"/>
+  <w:num w:numId="1" w16cid:durableId="562105375">
+    <w:abstractNumId w:val="0"/>
     <w:lvlOverride w:ilvl="0">
       <w:startOverride w:val="1"/>
     </w:lvlOverride>
@@ -1814,26 +1963,405 @@
 </file>
 
 <file path=word/styles.xml><?xml version="1.0" encoding="utf-8"?>
-<w:styles xmlns:mc="http://schemas.openxmlformats.org/markup-compatibility/2006" xmlns:r="http://schemas.openxmlformats.org/officeDocument/2006/relationships" xmlns:w="http://schemas.openxmlformats.org/wordprocessingml/2006/main" xmlns:w14="http://schemas.microsoft.com/office/word/2010/wordml" xmlns:w15="http://schemas.microsoft.com/office/word/2012/wordml" mc:Ignorable="w14 w15">
+<w:styles xmlns:mc="http://schemas.openxmlformats.org/markup-compatibility/2006" xmlns:r="http://schemas.openxmlformats.org/officeDocument/2006/relationships" xmlns:w="http://schemas.openxmlformats.org/wordprocessingml/2006/main" xmlns:w14="http://schemas.microsoft.com/office/word/2010/wordml" xmlns:w15="http://schemas.microsoft.com/office/word/2012/wordml" xmlns:w16cex="http://schemas.microsoft.com/office/word/2018/wordml/cex" xmlns:w16cid="http://schemas.microsoft.com/office/word/2016/wordml/cid" xmlns:w16="http://schemas.microsoft.com/office/word/2018/wordml" xmlns:w16du="http://schemas.microsoft.com/office/word/2023/wordml/word16du" xmlns:w16sdtdh="http://schemas.microsoft.com/office/word/2020/wordml/sdtdatahash" xmlns:w16sdtfl="http://schemas.microsoft.com/office/word/2024/wordml/sdtformatlock" xmlns:w16se="http://schemas.microsoft.com/office/word/2015/wordml/symex" mc:Ignorable="w14 w15 w16se w16cid w16 w16cex w16sdtdh w16sdtfl w16du">
   <w:docDefaults>
-    <w:rPrDefault/>
+    <w:rPrDefault>
+      <w:rPr>
+        <w:rFonts w:ascii="Times New Roman" w:eastAsia="Times New Roman" w:hAnsi="Times New Roman" w:cs="Times New Roman"/>
+        <w:lang w:val="en-AU" w:eastAsia="en-AU" w:bidi="ar-SA"/>
+      </w:rPr>
+    </w:rPrDefault>
     <w:pPrDefault/>
   </w:docDefaults>
-  <w:style w:type="paragraph" w:styleId="Title">
-    <w:name w:val="Title"/>
-    <w:basedOn w:val="Normal"/>
-    <w:next w:val="Normal"/>
+  <w:latentStyles w:defLockedState="0" w:defUIPriority="99" w:defSemiHidden="0" w:defUnhideWhenUsed="0" w:defQFormat="0" w:count="376">
+    <w:lsdException w:name="Normal" w:uiPriority="0" w:qFormat="1"/>
+    <w:lsdException w:name="heading 1" w:uiPriority="9" w:qFormat="1"/>
+    <w:lsdException w:name="heading 2" w:semiHidden="1" w:uiPriority="9" w:unhideWhenUsed="1" w:qFormat="1"/>
+    <w:lsdException w:name="heading 3" w:semiHidden="1" w:uiPriority="9" w:unhideWhenUsed="1" w:qFormat="1"/>
+    <w:lsdException w:name="heading 4" w:semiHidden="1" w:uiPriority="9" w:unhideWhenUsed="1" w:qFormat="1"/>
+    <w:lsdException w:name="heading 5" w:semiHidden="1" w:uiPriority="9" w:unhideWhenUsed="1" w:qFormat="1"/>
+    <w:lsdException w:name="heading 6" w:semiHidden="1" w:uiPriority="9" w:unhideWhenUsed="1" w:qFormat="1"/>
+    <w:lsdException w:name="heading 7" w:semiHidden="1" w:uiPriority="9" w:unhideWhenUsed="1" w:qFormat="1"/>
+    <w:lsdException w:name="heading 8" w:semiHidden="1" w:uiPriority="9" w:unhideWhenUsed="1" w:qFormat="1"/>
+    <w:lsdException w:name="heading 9" w:semiHidden="1" w:uiPriority="9" w:unhideWhenUsed="1" w:qFormat="1"/>
+    <w:lsdException w:name="index 1" w:semiHidden="1" w:unhideWhenUsed="1"/>
+    <w:lsdException w:name="index 2" w:semiHidden="1" w:unhideWhenUsed="1"/>
+    <w:lsdException w:name="index 3" w:semiHidden="1" w:unhideWhenUsed="1"/>
+    <w:lsdException w:name="index 4" w:semiHidden="1" w:unhideWhenUsed="1"/>
+    <w:lsdException w:name="index 5" w:semiHidden="1" w:unhideWhenUsed="1"/>
+    <w:lsdException w:name="index 6" w:semiHidden="1" w:unhideWhenUsed="1"/>
+    <w:lsdException w:name="index 7" w:semiHidden="1" w:unhideWhenUsed="1"/>
+    <w:lsdException w:name="index 8" w:semiHidden="1" w:unhideWhenUsed="1"/>
+    <w:lsdException w:name="index 9" w:semiHidden="1" w:unhideWhenUsed="1"/>
+    <w:lsdException w:name="toc 1" w:semiHidden="1" w:uiPriority="39" w:unhideWhenUsed="1"/>
+    <w:lsdException w:name="toc 2" w:semiHidden="1" w:uiPriority="39" w:unhideWhenUsed="1"/>
+    <w:lsdException w:name="toc 3" w:semiHidden="1" w:uiPriority="39" w:unhideWhenUsed="1"/>
+    <w:lsdException w:name="toc 4" w:semiHidden="1" w:uiPriority="39" w:unhideWhenUsed="1"/>
+    <w:lsdException w:name="toc 5" w:semiHidden="1" w:uiPriority="39" w:unhideWhenUsed="1"/>
+    <w:lsdException w:name="toc 6" w:semiHidden="1" w:uiPriority="39" w:unhideWhenUsed="1"/>
+    <w:lsdException w:name="toc 7" w:semiHidden="1" w:uiPriority="39" w:unhideWhenUsed="1"/>
+    <w:lsdException w:name="toc 8" w:semiHidden="1" w:uiPriority="39" w:unhideWhenUsed="1"/>
+    <w:lsdException w:name="toc 9" w:semiHidden="1" w:uiPriority="39" w:unhideWhenUsed="1"/>
+    <w:lsdException w:name="Normal Indent" w:semiHidden="1" w:unhideWhenUsed="1"/>
+    <w:lsdException w:name="footnote text" w:semiHidden="1" w:unhideWhenUsed="1"/>
+    <w:lsdException w:name="annotation text" w:semiHidden="1" w:unhideWhenUsed="1"/>
+    <w:lsdException w:name="header" w:semiHidden="1" w:unhideWhenUsed="1"/>
+    <w:lsdException w:name="footer" w:semiHidden="1" w:unhideWhenUsed="1"/>
+    <w:lsdException w:name="index heading" w:semiHidden="1" w:unhideWhenUsed="1"/>
+    <w:lsdException w:name="caption" w:semiHidden="1" w:uiPriority="35" w:unhideWhenUsed="1" w:qFormat="1"/>
+    <w:lsdException w:name="table of figures" w:semiHidden="1" w:unhideWhenUsed="1"/>
+    <w:lsdException w:name="envelope address" w:semiHidden="1" w:unhideWhenUsed="1"/>
+    <w:lsdException w:name="envelope return" w:semiHidden="1" w:unhideWhenUsed="1"/>
+    <w:lsdException w:name="footnote reference" w:semiHidden="1" w:unhideWhenUsed="1"/>
+    <w:lsdException w:name="annotation reference" w:semiHidden="1" w:unhideWhenUsed="1"/>
+    <w:lsdException w:name="line number" w:semiHidden="1" w:unhideWhenUsed="1"/>
+    <w:lsdException w:name="page number" w:semiHidden="1" w:unhideWhenUsed="1"/>
+    <w:lsdException w:name="endnote reference" w:semiHidden="1" w:unhideWhenUsed="1"/>
+    <w:lsdException w:name="endnote text" w:semiHidden="1" w:unhideWhenUsed="1"/>
+    <w:lsdException w:name="table of authorities" w:semiHidden="1" w:unhideWhenUsed="1"/>
+    <w:lsdException w:name="macro" w:semiHidden="1" w:unhideWhenUsed="1"/>
+    <w:lsdException w:name="toa heading" w:semiHidden="1" w:unhideWhenUsed="1"/>
+    <w:lsdException w:name="List" w:semiHidden="1" w:unhideWhenUsed="1"/>
+    <w:lsdException w:name="List Bullet" w:semiHidden="1" w:unhideWhenUsed="1"/>
+    <w:lsdException w:name="List Number" w:semiHidden="1" w:unhideWhenUsed="1"/>
+    <w:lsdException w:name="List 2" w:semiHidden="1" w:unhideWhenUsed="1"/>
+    <w:lsdException w:name="List 3" w:semiHidden="1" w:unhideWhenUsed="1"/>
+    <w:lsdException w:name="List 4" w:semiHidden="1" w:unhideWhenUsed="1"/>
+    <w:lsdException w:name="List 5" w:semiHidden="1" w:unhideWhenUsed="1"/>
+    <w:lsdException w:name="List Bullet 2" w:semiHidden="1" w:unhideWhenUsed="1"/>
+    <w:lsdException w:name="List Bullet 3" w:semiHidden="1" w:unhideWhenUsed="1"/>
+    <w:lsdException w:name="List Bullet 4" w:semiHidden="1" w:unhideWhenUsed="1"/>
+    <w:lsdException w:name="List Bullet 5" w:semiHidden="1" w:unhideWhenUsed="1"/>
+    <w:lsdException w:name="List Number 2" w:semiHidden="1" w:unhideWhenUsed="1"/>
+    <w:lsdException w:name="List Number 3" w:semiHidden="1" w:unhideWhenUsed="1"/>
+    <w:lsdException w:name="List Number 4" w:semiHidden="1" w:unhideWhenUsed="1"/>
+    <w:lsdException w:name="List Number 5" w:semiHidden="1" w:unhideWhenUsed="1"/>
+    <w:lsdException w:name="Title" w:uiPriority="10" w:qFormat="1"/>
+    <w:lsdException w:name="Closing" w:semiHidden="1" w:unhideWhenUsed="1"/>
+    <w:lsdException w:name="Signature" w:semiHidden="1" w:unhideWhenUsed="1"/>
+    <w:lsdException w:name="Default Paragraph Font" w:semiHidden="1" w:uiPriority="1" w:unhideWhenUsed="1"/>
+    <w:lsdException w:name="Body Text" w:semiHidden="1" w:unhideWhenUsed="1"/>
+    <w:lsdException w:name="Body Text Indent" w:semiHidden="1" w:unhideWhenUsed="1"/>
+    <w:lsdException w:name="List Continue" w:semiHidden="1" w:unhideWhenUsed="1"/>
+    <w:lsdException w:name="List Continue 2" w:semiHidden="1" w:unhideWhenUsed="1"/>
+    <w:lsdException w:name="List Continue 3" w:semiHidden="1" w:unhideWhenUsed="1"/>
+    <w:lsdException w:name="List Continue 4" w:semiHidden="1" w:unhideWhenUsed="1"/>
+    <w:lsdException w:name="List Continue 5" w:semiHidden="1" w:unhideWhenUsed="1"/>
+    <w:lsdException w:name="Message Header" w:semiHidden="1" w:unhideWhenUsed="1"/>
+    <w:lsdException w:name="Subtitle" w:uiPriority="11" w:qFormat="1"/>
+    <w:lsdException w:name="Salutation" w:semiHidden="1" w:unhideWhenUsed="1"/>
+    <w:lsdException w:name="Date" w:semiHidden="1" w:unhideWhenUsed="1"/>
+    <w:lsdException w:name="Body Text First Indent" w:semiHidden="1" w:unhideWhenUsed="1"/>
+    <w:lsdException w:name="Body Text First Indent 2" w:semiHidden="1" w:unhideWhenUsed="1"/>
+    <w:lsdException w:name="Note Heading" w:semiHidden="1" w:unhideWhenUsed="1"/>
+    <w:lsdException w:name="Body Text 2" w:semiHidden="1" w:unhideWhenUsed="1"/>
+    <w:lsdException w:name="Body Text 3" w:semiHidden="1" w:unhideWhenUsed="1"/>
+    <w:lsdException w:name="Body Text Indent 2" w:semiHidden="1" w:unhideWhenUsed="1"/>
+    <w:lsdException w:name="Body Text Indent 3" w:semiHidden="1" w:unhideWhenUsed="1"/>
+    <w:lsdException w:name="Block Text" w:semiHidden="1" w:unhideWhenUsed="1"/>
+    <w:lsdException w:name="Hyperlink" w:semiHidden="1" w:unhideWhenUsed="1"/>
+    <w:lsdException w:name="FollowedHyperlink" w:semiHidden="1" w:unhideWhenUsed="1"/>
+    <w:lsdException w:name="Strong" w:uiPriority="22" w:qFormat="1"/>
+    <w:lsdException w:name="Emphasis" w:uiPriority="20" w:qFormat="1"/>
+    <w:lsdException w:name="Document Map" w:semiHidden="1" w:unhideWhenUsed="1"/>
+    <w:lsdException w:name="Plain Text" w:semiHidden="1" w:unhideWhenUsed="1"/>
+    <w:lsdException w:name="E-mail Signature" w:semiHidden="1" w:unhideWhenUsed="1"/>
+    <w:lsdException w:name="HTML Top of Form" w:semiHidden="1" w:unhideWhenUsed="1"/>
+    <w:lsdException w:name="HTML Bottom of Form" w:semiHidden="1" w:unhideWhenUsed="1"/>
+    <w:lsdException w:name="Normal (Web)" w:semiHidden="1" w:unhideWhenUsed="1"/>
+    <w:lsdException w:name="HTML Acronym" w:semiHidden="1" w:unhideWhenUsed="1"/>
+    <w:lsdException w:name="HTML Address" w:semiHidden="1" w:unhideWhenUsed="1"/>
+    <w:lsdException w:name="HTML Cite" w:semiHidden="1" w:unhideWhenUsed="1"/>
+    <w:lsdException w:name="HTML Code" w:semiHidden="1" w:unhideWhenUsed="1"/>
+    <w:lsdException w:name="HTML Definition" w:semiHidden="1" w:unhideWhenUsed="1"/>
+    <w:lsdException w:name="HTML Keyboard" w:semiHidden="1" w:unhideWhenUsed="1"/>
+    <w:lsdException w:name="HTML Preformatted" w:semiHidden="1" w:unhideWhenUsed="1"/>
+    <w:lsdException w:name="HTML Sample" w:semiHidden="1" w:unhideWhenUsed="1"/>
+    <w:lsdException w:name="HTML Typewriter" w:semiHidden="1" w:unhideWhenUsed="1"/>
+    <w:lsdException w:name="HTML Variable" w:semiHidden="1" w:unhideWhenUsed="1"/>
+    <w:lsdException w:name="Normal Table" w:semiHidden="1" w:unhideWhenUsed="1"/>
+    <w:lsdException w:name="annotation subject" w:semiHidden="1" w:unhideWhenUsed="1"/>
+    <w:lsdException w:name="No List" w:semiHidden="1" w:unhideWhenUsed="1"/>
+    <w:lsdException w:name="Outline List 1" w:semiHidden="1" w:unhideWhenUsed="1"/>
+    <w:lsdException w:name="Outline List 2" w:semiHidden="1" w:unhideWhenUsed="1"/>
+    <w:lsdException w:name="Outline List 3" w:semiHidden="1" w:unhideWhenUsed="1"/>
+    <w:lsdException w:name="Table Simple 1" w:semiHidden="1" w:unhideWhenUsed="1"/>
+    <w:lsdException w:name="Table Simple 2" w:semiHidden="1" w:unhideWhenUsed="1"/>
+    <w:lsdException w:name="Table Simple 3" w:semiHidden="1" w:unhideWhenUsed="1"/>
+    <w:lsdException w:name="Table Classic 1" w:semiHidden="1" w:unhideWhenUsed="1"/>
+    <w:lsdException w:name="Table Classic 2" w:semiHidden="1" w:unhideWhenUsed="1"/>
+    <w:lsdException w:name="Table Classic 3" w:semiHidden="1" w:unhideWhenUsed="1"/>
+    <w:lsdException w:name="Table Classic 4" w:semiHidden="1" w:unhideWhenUsed="1"/>
+    <w:lsdException w:name="Table Colorful 1" w:semiHidden="1" w:unhideWhenUsed="1"/>
+    <w:lsdException w:name="Table Colorful 2" w:semiHidden="1" w:unhideWhenUsed="1"/>
+    <w:lsdException w:name="Table Colorful 3" w:semiHidden="1" w:unhideWhenUsed="1"/>
+    <w:lsdException w:name="Table Columns 1" w:semiHidden="1" w:unhideWhenUsed="1"/>
+    <w:lsdException w:name="Table Columns 2" w:semiHidden="1" w:unhideWhenUsed="1"/>
+    <w:lsdException w:name="Table Columns 3" w:semiHidden="1" w:unhideWhenUsed="1"/>
+    <w:lsdException w:name="Table Columns 4" w:semiHidden="1" w:unhideWhenUsed="1"/>
+    <w:lsdException w:name="Table Columns 5" w:semiHidden="1" w:unhideWhenUsed="1"/>
+    <w:lsdException w:name="Table Grid 1" w:semiHidden="1" w:unhideWhenUsed="1"/>
+    <w:lsdException w:name="Table Grid 2" w:semiHidden="1" w:unhideWhenUsed="1"/>
+    <w:lsdException w:name="Table Grid 3" w:semiHidden="1" w:unhideWhenUsed="1"/>
+    <w:lsdException w:name="Table Grid 4" w:semiHidden="1" w:unhideWhenUsed="1"/>
+    <w:lsdException w:name="Table Grid 5" w:semiHidden="1" w:unhideWhenUsed="1"/>
+    <w:lsdException w:name="Table Grid 6" w:semiHidden="1" w:unhideWhenUsed="1"/>
+    <w:lsdException w:name="Table Grid 7" w:semiHidden="1" w:unhideWhenUsed="1"/>
+    <w:lsdException w:name="Table Grid 8" w:semiHidden="1" w:unhideWhenUsed="1"/>
+    <w:lsdException w:name="Table List 1" w:semiHidden="1" w:unhideWhenUsed="1"/>
+    <w:lsdException w:name="Table List 2" w:semiHidden="1" w:unhideWhenUsed="1"/>
+    <w:lsdException w:name="Table List 3" w:semiHidden="1" w:unhideWhenUsed="1"/>
+    <w:lsdException w:name="Table List 4" w:semiHidden="1" w:unhideWhenUsed="1"/>
+    <w:lsdException w:name="Table List 5" w:semiHidden="1" w:unhideWhenUsed="1"/>
+    <w:lsdException w:name="Table List 6" w:semiHidden="1" w:unhideWhenUsed="1"/>
+    <w:lsdException w:name="Table List 7" w:semiHidden="1" w:unhideWhenUsed="1"/>
+    <w:lsdException w:name="Table List 8" w:semiHidden="1" w:unhideWhenUsed="1"/>
+    <w:lsdException w:name="Table 3D effects 1" w:semiHidden="1" w:unhideWhenUsed="1"/>
+    <w:lsdException w:name="Table 3D effects 2" w:semiHidden="1" w:unhideWhenUsed="1"/>
+    <w:lsdException w:name="Table 3D effects 3" w:semiHidden="1" w:unhideWhenUsed="1"/>
+    <w:lsdException w:name="Table Contemporary" w:semiHidden="1" w:unhideWhenUsed="1"/>
+    <w:lsdException w:name="Table Elegant" w:semiHidden="1" w:unhideWhenUsed="1"/>
+    <w:lsdException w:name="Table Professional" w:semiHidden="1" w:unhideWhenUsed="1"/>
+    <w:lsdException w:name="Table Subtle 1" w:semiHidden="1" w:unhideWhenUsed="1"/>
+    <w:lsdException w:name="Table Subtle 2" w:semiHidden="1" w:unhideWhenUsed="1"/>
+    <w:lsdException w:name="Table Web 1" w:semiHidden="1" w:unhideWhenUsed="1"/>
+    <w:lsdException w:name="Table Web 2" w:semiHidden="1" w:unhideWhenUsed="1"/>
+    <w:lsdException w:name="Table Web 3" w:semiHidden="1" w:unhideWhenUsed="1"/>
+    <w:lsdException w:name="Balloon Text" w:semiHidden="1" w:unhideWhenUsed="1"/>
+    <w:lsdException w:name="Table Grid" w:uiPriority="39"/>
+    <w:lsdException w:name="Table Theme" w:semiHidden="1" w:unhideWhenUsed="1"/>
+    <w:lsdException w:name="Placeholder Text" w:semiHidden="1"/>
+    <w:lsdException w:name="No Spacing" w:uiPriority="1" w:qFormat="1"/>
+    <w:lsdException w:name="Light Shading" w:uiPriority="60"/>
+    <w:lsdException w:name="Light List" w:uiPriority="61"/>
+    <w:lsdException w:name="Light Grid" w:uiPriority="62"/>
+    <w:lsdException w:name="Medium Shading 1" w:uiPriority="63"/>
+    <w:lsdException w:name="Medium Shading 2" w:uiPriority="64"/>
+    <w:lsdException w:name="Medium List 1" w:uiPriority="65"/>
+    <w:lsdException w:name="Medium List 2" w:uiPriority="66"/>
+    <w:lsdException w:name="Medium Grid 1" w:uiPriority="67"/>
+    <w:lsdException w:name="Medium Grid 2" w:uiPriority="68"/>
+    <w:lsdException w:name="Medium Grid 3" w:uiPriority="69"/>
+    <w:lsdException w:name="Dark List" w:uiPriority="70"/>
+    <w:lsdException w:name="Colorful Shading" w:uiPriority="71"/>
+    <w:lsdException w:name="Colorful List" w:uiPriority="72"/>
+    <w:lsdException w:name="Colorful Grid" w:uiPriority="73"/>
+    <w:lsdException w:name="Light Shading Accent 1" w:uiPriority="60"/>
+    <w:lsdException w:name="Light List Accent 1" w:uiPriority="61"/>
+    <w:lsdException w:name="Light Grid Accent 1" w:uiPriority="62"/>
+    <w:lsdException w:name="Medium Shading 1 Accent 1" w:uiPriority="63"/>
+    <w:lsdException w:name="Medium Shading 2 Accent 1" w:uiPriority="64"/>
+    <w:lsdException w:name="Medium List 1 Accent 1" w:uiPriority="65"/>
+    <w:lsdException w:name="Revision" w:semiHidden="1"/>
+    <w:lsdException w:name="List Paragraph" w:uiPriority="34" w:qFormat="1"/>
+    <w:lsdException w:name="Quote" w:uiPriority="29" w:qFormat="1"/>
+    <w:lsdException w:name="Intense Quote" w:uiPriority="30" w:qFormat="1"/>
+    <w:lsdException w:name="Medium List 2 Accent 1" w:uiPriority="66"/>
+    <w:lsdException w:name="Medium Grid 1 Accent 1" w:uiPriority="67"/>
+    <w:lsdException w:name="Medium Grid 2 Accent 1" w:uiPriority="68"/>
+    <w:lsdException w:name="Medium Grid 3 Accent 1" w:uiPriority="69"/>
+    <w:lsdException w:name="Dark List Accent 1" w:uiPriority="70"/>
+    <w:lsdException w:name="Colorful Shading Accent 1" w:uiPriority="71"/>
+    <w:lsdException w:name="Colorful List Accent 1" w:uiPriority="72"/>
+    <w:lsdException w:name="Colorful Grid Accent 1" w:uiPriority="73"/>
+    <w:lsdException w:name="Light Shading Accent 2" w:uiPriority="60"/>
+    <w:lsdException w:name="Light List Accent 2" w:uiPriority="61"/>
+    <w:lsdException w:name="Light Grid Accent 2" w:uiPriority="62"/>
+    <w:lsdException w:name="Medium Shading 1 Accent 2" w:uiPriority="63"/>
+    <w:lsdException w:name="Medium Shading 2 Accent 2" w:uiPriority="64"/>
+    <w:lsdException w:name="Medium List 1 Accent 2" w:uiPriority="65"/>
+    <w:lsdException w:name="Medium List 2 Accent 2" w:uiPriority="66"/>
+    <w:lsdException w:name="Medium Grid 1 Accent 2" w:uiPriority="67"/>
+    <w:lsdException w:name="Medium Grid 2 Accent 2" w:uiPriority="68"/>
+    <w:lsdException w:name="Medium Grid 3 Accent 2" w:uiPriority="69"/>
+    <w:lsdException w:name="Dark List Accent 2" w:uiPriority="70"/>
+    <w:lsdException w:name="Colorful Shading Accent 2" w:uiPriority="71"/>
+    <w:lsdException w:name="Colorful List Accent 2" w:uiPriority="72"/>
+    <w:lsdException w:name="Colorful Grid Accent 2" w:uiPriority="73"/>
+    <w:lsdException w:name="Light Shading Accent 3" w:uiPriority="60"/>
+    <w:lsdException w:name="Light List Accent 3" w:uiPriority="61"/>
+    <w:lsdException w:name="Light Grid Accent 3" w:uiPriority="62"/>
+    <w:lsdException w:name="Medium Shading 1 Accent 3" w:uiPriority="63"/>
+    <w:lsdException w:name="Medium Shading 2 Accent 3" w:uiPriority="64"/>
+    <w:lsdException w:name="Medium List 1 Accent 3" w:uiPriority="65"/>
+    <w:lsdException w:name="Medium List 2 Accent 3" w:uiPriority="66"/>
+    <w:lsdException w:name="Medium Grid 1 Accent 3" w:uiPriority="67"/>
+    <w:lsdException w:name="Medium Grid 2 Accent 3" w:uiPriority="68"/>
+    <w:lsdException w:name="Medium Grid 3 Accent 3" w:uiPriority="69"/>
+    <w:lsdException w:name="Dark List Accent 3" w:uiPriority="70"/>
+    <w:lsdException w:name="Colorful Shading Accent 3" w:uiPriority="71"/>
+    <w:lsdException w:name="Colorful List Accent 3" w:uiPriority="72"/>
+    <w:lsdException w:name="Colorful Grid Accent 3" w:uiPriority="73"/>
+    <w:lsdException w:name="Light Shading Accent 4" w:uiPriority="60"/>
+    <w:lsdException w:name="Light List Accent 4" w:uiPriority="61"/>
+    <w:lsdException w:name="Light Grid Accent 4" w:uiPriority="62"/>
+    <w:lsdException w:name="Medium Shading 1 Accent 4" w:uiPriority="63"/>
+    <w:lsdException w:name="Medium Shading 2 Accent 4" w:uiPriority="64"/>
+    <w:lsdException w:name="Medium List 1 Accent 4" w:uiPriority="65"/>
+    <w:lsdException w:name="Medium List 2 Accent 4" w:uiPriority="66"/>
+    <w:lsdException w:name="Medium Grid 1 Accent 4" w:uiPriority="67"/>
+    <w:lsdException w:name="Medium Grid 2 Accent 4" w:uiPriority="68"/>
+    <w:lsdException w:name="Medium Grid 3 Accent 4" w:uiPriority="69"/>
+    <w:lsdException w:name="Dark List Accent 4" w:uiPriority="70"/>
+    <w:lsdException w:name="Colorful Shading Accent 4" w:uiPriority="71"/>
+    <w:lsdException w:name="Colorful List Accent 4" w:uiPriority="72"/>
+    <w:lsdException w:name="Colorful Grid Accent 4" w:uiPriority="73"/>
+    <w:lsdException w:name="Light Shading Accent 5" w:uiPriority="60"/>
+    <w:lsdException w:name="Light List Accent 5" w:uiPriority="61"/>
+    <w:lsdException w:name="Light Grid Accent 5" w:uiPriority="62"/>
+    <w:lsdException w:name="Medium Shading 1 Accent 5" w:uiPriority="63"/>
+    <w:lsdException w:name="Medium Shading 2 Accent 5" w:uiPriority="64"/>
+    <w:lsdException w:name="Medium List 1 Accent 5" w:uiPriority="65"/>
+    <w:lsdException w:name="Medium List 2 Accent 5" w:uiPriority="66"/>
+    <w:lsdException w:name="Medium Grid 1 Accent 5" w:uiPriority="67"/>
+    <w:lsdException w:name="Medium Grid 2 Accent 5" w:uiPriority="68"/>
+    <w:lsdException w:name="Medium Grid 3 Accent 5" w:uiPriority="69"/>
+    <w:lsdException w:name="Dark List Accent 5" w:uiPriority="70"/>
+    <w:lsdException w:name="Colorful Shading Accent 5" w:uiPriority="71"/>
+    <w:lsdException w:name="Colorful List Accent 5" w:uiPriority="72"/>
+    <w:lsdException w:name="Colorful Grid Accent 5" w:uiPriority="73"/>
+    <w:lsdException w:name="Light Shading Accent 6" w:uiPriority="60"/>
+    <w:lsdException w:name="Light List Accent 6" w:uiPriority="61"/>
+    <w:lsdException w:name="Light Grid Accent 6" w:uiPriority="62"/>
+    <w:lsdException w:name="Medium Shading 1 Accent 6" w:uiPriority="63"/>
+    <w:lsdException w:name="Medium Shading 2 Accent 6" w:uiPriority="64"/>
+    <w:lsdException w:name="Medium List 1 Accent 6" w:uiPriority="65"/>
+    <w:lsdException w:name="Medium List 2 Accent 6" w:uiPriority="66"/>
+    <w:lsdException w:name="Medium Grid 1 Accent 6" w:uiPriority="67"/>
+    <w:lsdException w:name="Medium Grid 2 Accent 6" w:uiPriority="68"/>
+    <w:lsdException w:name="Medium Grid 3 Accent 6" w:uiPriority="69"/>
+    <w:lsdException w:name="Dark List Accent 6" w:uiPriority="70"/>
+    <w:lsdException w:name="Colorful Shading Accent 6" w:uiPriority="71"/>
+    <w:lsdException w:name="Colorful List Accent 6" w:uiPriority="72"/>
+    <w:lsdException w:name="Colorful Grid Accent 6" w:uiPriority="73"/>
+    <w:lsdException w:name="Subtle Emphasis" w:uiPriority="19" w:qFormat="1"/>
+    <w:lsdException w:name="Intense Emphasis" w:uiPriority="21" w:qFormat="1"/>
+    <w:lsdException w:name="Subtle Reference" w:uiPriority="31" w:qFormat="1"/>
+    <w:lsdException w:name="Intense Reference" w:uiPriority="32" w:qFormat="1"/>
+    <w:lsdException w:name="Book Title" w:uiPriority="33" w:qFormat="1"/>
+    <w:lsdException w:name="Bibliography" w:semiHidden="1" w:uiPriority="37" w:unhideWhenUsed="1"/>
+    <w:lsdException w:name="TOC Heading" w:semiHidden="1" w:uiPriority="39" w:unhideWhenUsed="1" w:qFormat="1"/>
+    <w:lsdException w:name="Plain Table 1" w:uiPriority="41"/>
+    <w:lsdException w:name="Plain Table 2" w:uiPriority="42"/>
+    <w:lsdException w:name="Plain Table 3" w:uiPriority="43"/>
+    <w:lsdException w:name="Plain Table 4" w:uiPriority="44"/>
+    <w:lsdException w:name="Plain Table 5" w:uiPriority="45"/>
+    <w:lsdException w:name="Grid Table Light" w:uiPriority="40"/>
+    <w:lsdException w:name="Grid Table 1 Light" w:uiPriority="46"/>
+    <w:lsdException w:name="Grid Table 2" w:uiPriority="47"/>
+    <w:lsdException w:name="Grid Table 3" w:uiPriority="48"/>
+    <w:lsdException w:name="Grid Table 4" w:uiPriority="49"/>
+    <w:lsdException w:name="Grid Table 5 Dark" w:uiPriority="50"/>
+    <w:lsdException w:name="Grid Table 6 Colorful" w:uiPriority="51"/>
+    <w:lsdException w:name="Grid Table 7 Colorful" w:uiPriority="52"/>
+    <w:lsdException w:name="Grid Table 1 Light Accent 1" w:uiPriority="46"/>
+    <w:lsdException w:name="Grid Table 2 Accent 1" w:uiPriority="47"/>
+    <w:lsdException w:name="Grid Table 3 Accent 1" w:uiPriority="48"/>
+    <w:lsdException w:name="Grid Table 4 Accent 1" w:uiPriority="49"/>
+    <w:lsdException w:name="Grid Table 5 Dark Accent 1" w:uiPriority="50"/>
+    <w:lsdException w:name="Grid Table 6 Colorful Accent 1" w:uiPriority="51"/>
+    <w:lsdException w:name="Grid Table 7 Colorful Accent 1" w:uiPriority="52"/>
+    <w:lsdException w:name="Grid Table 1 Light Accent 2" w:uiPriority="46"/>
+    <w:lsdException w:name="Grid Table 2 Accent 2" w:uiPriority="47"/>
+    <w:lsdException w:name="Grid Table 3 Accent 2" w:uiPriority="48"/>
+    <w:lsdException w:name="Grid Table 4 Accent 2" w:uiPriority="49"/>
+    <w:lsdException w:name="Grid Table 5 Dark Accent 2" w:uiPriority="50"/>
+    <w:lsdException w:name="Grid Table 6 Colorful Accent 2" w:uiPriority="51"/>
+    <w:lsdException w:name="Grid Table 7 Colorful Accent 2" w:uiPriority="52"/>
+    <w:lsdException w:name="Grid Table 1 Light Accent 3" w:uiPriority="46"/>
+    <w:lsdException w:name="Grid Table 2 Accent 3" w:uiPriority="47"/>
+    <w:lsdException w:name="Grid Table 3 Accent 3" w:uiPriority="48"/>
+    <w:lsdException w:name="Grid Table 4 Accent 3" w:uiPriority="49"/>
+    <w:lsdException w:name="Grid Table 5 Dark Accent 3" w:uiPriority="50"/>
+    <w:lsdException w:name="Grid Table 6 Colorful Accent 3" w:uiPriority="51"/>
+    <w:lsdException w:name="Grid Table 7 Colorful Accent 3" w:uiPriority="52"/>
+    <w:lsdException w:name="Grid Table 1 Light Accent 4" w:uiPriority="46"/>
+    <w:lsdException w:name="Grid Table 2 Accent 4" w:uiPriority="47"/>
+    <w:lsdException w:name="Grid Table 3 Accent 4" w:uiPriority="48"/>
+    <w:lsdException w:name="Grid Table 4 Accent 4" w:uiPriority="49"/>
+    <w:lsdException w:name="Grid Table 5 Dark Accent 4" w:uiPriority="50"/>
+    <w:lsdException w:name="Grid Table 6 Colorful Accent 4" w:uiPriority="51"/>
+    <w:lsdException w:name="Grid Table 7 Colorful Accent 4" w:uiPriority="52"/>
+    <w:lsdException w:name="Grid Table 1 Light Accent 5" w:uiPriority="46"/>
+    <w:lsdException w:name="Grid Table 2 Accent 5" w:uiPriority="47"/>
+    <w:lsdException w:name="Grid Table 3 Accent 5" w:uiPriority="48"/>
+    <w:lsdException w:name="Grid Table 4 Accent 5" w:uiPriority="49"/>
+    <w:lsdException w:name="Grid Table 5 Dark Accent 5" w:uiPriority="50"/>
+    <w:lsdException w:name="Grid Table 6 Colorful Accent 5" w:uiPriority="51"/>
+    <w:lsdException w:name="Grid Table 7 Colorful Accent 5" w:uiPriority="52"/>
+    <w:lsdException w:name="Grid Table 1 Light Accent 6" w:uiPriority="46"/>
+    <w:lsdException w:name="Grid Table 2 Accent 6" w:uiPriority="47"/>
+    <w:lsdException w:name="Grid Table 3 Accent 6" w:uiPriority="48"/>
+    <w:lsdException w:name="Grid Table 4 Accent 6" w:uiPriority="49"/>
+    <w:lsdException w:name="Grid Table 5 Dark Accent 6" w:uiPriority="50"/>
+    <w:lsdException w:name="Grid Table 6 Colorful Accent 6" w:uiPriority="51"/>
+    <w:lsdException w:name="Grid Table 7 Colorful Accent 6" w:uiPriority="52"/>
+    <w:lsdException w:name="List Table 1 Light" w:uiPriority="46"/>
+    <w:lsdException w:name="List Table 2" w:uiPriority="47"/>
+    <w:lsdException w:name="List Table 3" w:uiPriority="48"/>
+    <w:lsdException w:name="List Table 4" w:uiPriority="49"/>
+    <w:lsdException w:name="List Table 5 Dark" w:uiPriority="50"/>
+    <w:lsdException w:name="List Table 6 Colorful" w:uiPriority="51"/>
+    <w:lsdException w:name="List Table 7 Colorful" w:uiPriority="52"/>
+    <w:lsdException w:name="List Table 1 Light Accent 1" w:uiPriority="46"/>
+    <w:lsdException w:name="List Table 2 Accent 1" w:uiPriority="47"/>
+    <w:lsdException w:name="List Table 3 Accent 1" w:uiPriority="48"/>
+    <w:lsdException w:name="List Table 4 Accent 1" w:uiPriority="49"/>
+    <w:lsdException w:name="List Table 5 Dark Accent 1" w:uiPriority="50"/>
+    <w:lsdException w:name="List Table 6 Colorful Accent 1" w:uiPriority="51"/>
+    <w:lsdException w:name="List Table 7 Colorful Accent 1" w:uiPriority="52"/>
+    <w:lsdException w:name="List Table 1 Light Accent 2" w:uiPriority="46"/>
+    <w:lsdException w:name="List Table 2 Accent 2" w:uiPriority="47"/>
+    <w:lsdException w:name="List Table 3 Accent 2" w:uiPriority="48"/>
+    <w:lsdException w:name="List Table 4 Accent 2" w:uiPriority="49"/>
+    <w:lsdException w:name="List Table 5 Dark Accent 2" w:uiPriority="50"/>
+    <w:lsdException w:name="List Table 6 Colorful Accent 2" w:uiPriority="51"/>
+    <w:lsdException w:name="List Table 7 Colorful Accent 2" w:uiPriority="52"/>
+    <w:lsdException w:name="List Table 1 Light Accent 3" w:uiPriority="46"/>
+    <w:lsdException w:name="List Table 2 Accent 3" w:uiPriority="47"/>
+    <w:lsdException w:name="List Table 3 Accent 3" w:uiPriority="48"/>
+    <w:lsdException w:name="List Table 4 Accent 3" w:uiPriority="49"/>
+    <w:lsdException w:name="List Table 5 Dark Accent 3" w:uiPriority="50"/>
+    <w:lsdException w:name="List Table 6 Colorful Accent 3" w:uiPriority="51"/>
+    <w:lsdException w:name="List Table 7 Colorful Accent 3" w:uiPriority="52"/>
+    <w:lsdException w:name="List Table 1 Light Accent 4" w:uiPriority="46"/>
+    <w:lsdException w:name="List Table 2 Accent 4" w:uiPriority="47"/>
+    <w:lsdException w:name="List Table 3 Accent 4" w:uiPriority="48"/>
+    <w:lsdException w:name="List Table 4 Accent 4" w:uiPriority="49"/>
+    <w:lsdException w:name="List Table 5 Dark Accent 4" w:uiPriority="50"/>
+    <w:lsdException w:name="List Table 6 Colorful Accent 4" w:uiPriority="51"/>
+    <w:lsdException w:name="List Table 7 Colorful Accent 4" w:uiPriority="52"/>
+    <w:lsdException w:name="List Table 1 Light Accent 5" w:uiPriority="46"/>
+    <w:lsdException w:name="List Table 2 Accent 5" w:uiPriority="47"/>
+    <w:lsdException w:name="List Table 3 Accent 5" w:uiPriority="48"/>
+    <w:lsdException w:name="List Table 4 Accent 5" w:uiPriority="49"/>
+    <w:lsdException w:name="List Table 5 Dark Accent 5" w:uiPriority="50"/>
+    <w:lsdException w:name="List Table 6 Colorful Accent 5" w:uiPriority="51"/>
+    <w:lsdException w:name="List Table 7 Colorful Accent 5" w:uiPriority="52"/>
+    <w:lsdException w:name="List Table 1 Light Accent 6" w:uiPriority="46"/>
+    <w:lsdException w:name="List Table 2 Accent 6" w:uiPriority="47"/>
+    <w:lsdException w:name="List Table 3 Accent 6" w:uiPriority="48"/>
+    <w:lsdException w:name="List Table 4 Accent 6" w:uiPriority="49"/>
+    <w:lsdException w:name="List Table 5 Dark Accent 6" w:uiPriority="50"/>
+    <w:lsdException w:name="List Table 6 Colorful Accent 6" w:uiPriority="51"/>
+    <w:lsdException w:name="List Table 7 Colorful Accent 6" w:uiPriority="52"/>
+    <w:lsdException w:name="Mention" w:semiHidden="1" w:unhideWhenUsed="1"/>
+    <w:lsdException w:name="Smart Hyperlink" w:semiHidden="1" w:unhideWhenUsed="1"/>
+    <w:lsdException w:name="Hashtag" w:semiHidden="1" w:unhideWhenUsed="1"/>
+    <w:lsdException w:name="Unresolved Mention" w:semiHidden="1" w:unhideWhenUsed="1"/>
+    <w:lsdException w:name="Smart Link" w:semiHidden="1" w:unhideWhenUsed="1"/>
+  </w:latentStyles>
+  <w:style w:type="paragraph" w:default="1" w:styleId="Normal">
+    <w:name w:val="Normal"/>
     <w:qFormat/>
-    <w:rPr>
-      <w:sz w:val="56"/>
-      <w:szCs w:val="56"/>
-    </w:rPr>
   </w:style>
   <w:style w:type="paragraph" w:styleId="Heading1">
-    <w:name w:val="Heading 1"/>
-    <w:basedOn w:val="Normal"/>
-    <w:next w:val="Normal"/>
+    <w:name w:val="heading 1"/>
+    <w:uiPriority w:val="9"/>
     <w:qFormat/>
+    <w:pPr>
+      <w:outlineLvl w:val="0"/>
+    </w:pPr>
     <w:rPr>
       <w:color w:val="2E74B5"/>
       <w:sz w:val="32"/>
@@ -1841,10 +2369,13 @@
     </w:rPr>
   </w:style>
   <w:style w:type="paragraph" w:styleId="Heading2">
-    <w:name w:val="Heading 2"/>
-    <w:basedOn w:val="Normal"/>
-    <w:next w:val="Normal"/>
+    <w:name w:val="heading 2"/>
+    <w:uiPriority w:val="9"/>
+    <w:unhideWhenUsed/>
     <w:qFormat/>
+    <w:pPr>
+      <w:outlineLvl w:val="1"/>
+    </w:pPr>
     <w:rPr>
       <w:color w:val="2E74B5"/>
       <w:sz w:val="26"/>
@@ -1852,10 +2383,14 @@
     </w:rPr>
   </w:style>
   <w:style w:type="paragraph" w:styleId="Heading3">
-    <w:name w:val="Heading 3"/>
-    <w:basedOn w:val="Normal"/>
-    <w:next w:val="Normal"/>
+    <w:name w:val="heading 3"/>
+    <w:uiPriority w:val="9"/>
+    <w:semiHidden/>
+    <w:unhideWhenUsed/>
     <w:qFormat/>
+    <w:pPr>
+      <w:outlineLvl w:val="2"/>
+    </w:pPr>
     <w:rPr>
       <w:color w:val="1F4D78"/>
       <w:sz w:val="24"/>
@@ -1863,10 +2398,14 @@
     </w:rPr>
   </w:style>
   <w:style w:type="paragraph" w:styleId="Heading4">
-    <w:name w:val="Heading 4"/>
-    <w:basedOn w:val="Normal"/>
-    <w:next w:val="Normal"/>
+    <w:name w:val="heading 4"/>
+    <w:uiPriority w:val="9"/>
+    <w:semiHidden/>
+    <w:unhideWhenUsed/>
     <w:qFormat/>
+    <w:pPr>
+      <w:outlineLvl w:val="3"/>
+    </w:pPr>
     <w:rPr>
       <w:i/>
       <w:iCs/>
@@ -1874,27 +2413,68 @@
     </w:rPr>
   </w:style>
   <w:style w:type="paragraph" w:styleId="Heading5">
-    <w:name w:val="Heading 5"/>
-    <w:basedOn w:val="Normal"/>
-    <w:next w:val="Normal"/>
+    <w:name w:val="heading 5"/>
+    <w:uiPriority w:val="9"/>
+    <w:semiHidden/>
+    <w:unhideWhenUsed/>
     <w:qFormat/>
+    <w:pPr>
+      <w:outlineLvl w:val="4"/>
+    </w:pPr>
     <w:rPr>
       <w:color w:val="2E74B5"/>
     </w:rPr>
   </w:style>
   <w:style w:type="paragraph" w:styleId="Heading6">
-    <w:name w:val="Heading 6"/>
-    <w:basedOn w:val="Normal"/>
-    <w:next w:val="Normal"/>
+    <w:name w:val="heading 6"/>
+    <w:uiPriority w:val="9"/>
+    <w:semiHidden/>
+    <w:unhideWhenUsed/>
     <w:qFormat/>
+    <w:pPr>
+      <w:outlineLvl w:val="5"/>
+    </w:pPr>
     <w:rPr>
       <w:color w:val="1F4D78"/>
     </w:rPr>
   </w:style>
-  <w:style w:type="paragraph" w:styleId="Strong">
-    <w:name w:val="Strong"/>
-    <w:basedOn w:val="Normal"/>
-    <w:next w:val="Normal"/>
+  <w:style w:type="character" w:default="1" w:styleId="DefaultParagraphFont">
+    <w:name w:val="Default Paragraph Font"/>
+    <w:uiPriority w:val="1"/>
+    <w:unhideWhenUsed/>
+  </w:style>
+  <w:style w:type="table" w:default="1" w:styleId="TableNormal">
+    <w:name w:val="Normal Table"/>
+    <w:uiPriority w:val="99"/>
+    <w:semiHidden/>
+    <w:unhideWhenUsed/>
+    <w:tblPr>
+      <w:tblInd w:w="0" w:type="dxa"/>
+      <w:tblCellMar>
+        <w:top w:w="0" w:type="dxa"/>
+        <w:left w:w="108" w:type="dxa"/>
+        <w:bottom w:w="0" w:type="dxa"/>
+        <w:right w:w="108" w:type="dxa"/>
+      </w:tblCellMar>
+    </w:tblPr>
+  </w:style>
+  <w:style w:type="numbering" w:default="1" w:styleId="NoList">
+    <w:name w:val="No List"/>
+    <w:uiPriority w:val="99"/>
+    <w:semiHidden/>
+    <w:unhideWhenUsed/>
+  </w:style>
+  <w:style w:type="paragraph" w:styleId="Title">
+    <w:name w:val="Title"/>
+    <w:uiPriority w:val="10"/>
+    <w:qFormat/>
+    <w:rPr>
+      <w:sz w:val="56"/>
+      <w:szCs w:val="56"/>
+    </w:rPr>
+  </w:style>
+  <w:style w:type="paragraph" w:customStyle="1" w:styleId="Strong1">
+    <w:name w:val="Strong1"/>
     <w:qFormat/>
     <w:rPr>
       <w:b/>
@@ -1903,12 +2483,10 @@
   </w:style>
   <w:style w:type="paragraph" w:styleId="ListParagraph">
     <w:name w:val="List Paragraph"/>
-    <w:basedOn w:val="Normal"/>
     <w:qFormat/>
   </w:style>
   <w:style w:type="character" w:styleId="Hyperlink">
     <w:name w:val="Hyperlink"/>
-    <w:basedOn w:val="DefaultParagraphFont"/>
     <w:uiPriority w:val="99"/>
     <w:unhideWhenUsed/>
     <w:rPr>
@@ -1918,7 +2496,6 @@
   </w:style>
   <w:style w:type="character" w:styleId="FootnoteReference">
     <w:name w:val="footnote reference"/>
-    <w:basedOn w:val="DefaultParagraphFont"/>
     <w:uiPriority w:val="99"/>
     <w:semiHidden/>
     <w:unhideWhenUsed/>
@@ -1928,22 +2505,13 @@
   </w:style>
   <w:style w:type="paragraph" w:styleId="FootnoteText">
     <w:name w:val="footnote text"/>
-    <w:basedOn w:val="Normal"/>
     <w:link w:val="FootnoteTextChar"/>
     <w:uiPriority w:val="99"/>
     <w:semiHidden/>
     <w:unhideWhenUsed/>
-    <w:pPr>
-      <w:spacing w:after="0" w:line="240" w:lineRule="auto"/>
-    </w:pPr>
-    <w:rPr>
-      <w:sz w:val="20"/>
-      <w:szCs w:val="20"/>
-    </w:rPr>
   </w:style>
-  <w:style w:type="character" w:styleId="FootnoteTextChar">
+  <w:style w:type="character" w:customStyle="1" w:styleId="FootnoteTextChar">
     <w:name w:val="Footnote Text Char"/>
-    <w:basedOn w:val="DefaultParagraphFont"/>
     <w:link w:val="FootnoteText"/>
     <w:uiPriority w:val="99"/>
     <w:semiHidden/>
@@ -1955,7 +2523,6 @@
   </w:style>
   <w:style w:type="character" w:styleId="EndnoteReference">
     <w:name w:val="endnote reference"/>
-    <w:basedOn w:val="DefaultParagraphFont"/>
     <w:uiPriority w:val="99"/>
     <w:semiHidden/>
     <w:unhideWhenUsed/>
@@ -1965,22 +2532,13 @@
   </w:style>
   <w:style w:type="paragraph" w:styleId="EndnoteText">
     <w:name w:val="endnote text"/>
-    <w:basedOn w:val="Normal"/>
     <w:link w:val="EndnoteTextChar"/>
     <w:uiPriority w:val="99"/>
     <w:semiHidden/>
     <w:unhideWhenUsed/>
-    <w:pPr>
-      <w:spacing w:after="0" w:line="240" w:lineRule="auto"/>
-    </w:pPr>
-    <w:rPr>
-      <w:sz w:val="20"/>
-      <w:szCs w:val="20"/>
-    </w:rPr>
   </w:style>
-  <w:style w:type="character" w:styleId="EndnoteTextChar">
+  <w:style w:type="character" w:customStyle="1" w:styleId="EndnoteTextChar">
     <w:name w:val="Endnote Text Char"/>
-    <w:basedOn w:val="DefaultParagraphFont"/>
     <w:link w:val="EndnoteText"/>
     <w:uiPriority w:val="99"/>
     <w:semiHidden/>
@@ -1990,5 +2548,332 @@
       <w:szCs w:val="20"/>
     </w:rPr>
   </w:style>
+  <w:style w:type="character" w:styleId="UnresolvedMention">
+    <w:name w:val="Unresolved Mention"/>
+    <w:basedOn w:val="DefaultParagraphFont"/>
+    <w:uiPriority w:val="99"/>
+    <w:semiHidden/>
+    <w:unhideWhenUsed/>
+    <w:rsid w:val="002E2E09"/>
+    <w:rPr>
+      <w:color w:val="605E5C"/>
+      <w:shd w:val="clear" w:color="auto" w:fill="E1DFDD"/>
+    </w:rPr>
+  </w:style>
 </w:styles>
+</file>
+
+<file path=word/theme/theme1.xml><?xml version="1.0" encoding="utf-8"?>
+<a:theme xmlns:a="http://schemas.openxmlformats.org/drawingml/2006/main" name="Office Theme">
+  <a:themeElements>
+    <a:clrScheme name="Office">
+      <a:dk1>
+        <a:sysClr val="windowText" lastClr="000000"/>
+      </a:dk1>
+      <a:lt1>
+        <a:sysClr val="window" lastClr="FFFFFF"/>
+      </a:lt1>
+      <a:dk2>
+        <a:srgbClr val="0E2841"/>
+      </a:dk2>
+      <a:lt2>
+        <a:srgbClr val="E8E8E8"/>
+      </a:lt2>
+      <a:accent1>
+        <a:srgbClr val="156082"/>
+      </a:accent1>
+      <a:accent2>
+        <a:srgbClr val="E97132"/>
+      </a:accent2>
+      <a:accent3>
+        <a:srgbClr val="196B24"/>
+      </a:accent3>
+      <a:accent4>
+        <a:srgbClr val="0F9ED5"/>
+      </a:accent4>
+      <a:accent5>
+        <a:srgbClr val="A02B93"/>
+      </a:accent5>
+      <a:accent6>
+        <a:srgbClr val="4EA72E"/>
+      </a:accent6>
+      <a:hlink>
+        <a:srgbClr val="467886"/>
+      </a:hlink>
+      <a:folHlink>
+        <a:srgbClr val="96607D"/>
+      </a:folHlink>
+    </a:clrScheme>
+    <a:fontScheme name="Office">
+      <a:majorFont>
+        <a:latin typeface="Aptos Display" panose="02110004020202020204"/>
+        <a:ea typeface=""/>
+        <a:cs typeface=""/>
+        <a:font script="Jpan" typeface="游ゴシック Light"/>
+        <a:font script="Hang" typeface="맑은 고딕"/>
+        <a:font script="Hans" typeface="等线 Light"/>
+        <a:font script="Hant" typeface="新細明體"/>
+        <a:font script="Arab" typeface="Times New Roman"/>
+        <a:font script="Hebr" typeface="Times New Roman"/>
+        <a:font script="Thai" typeface="Angsana New"/>
+        <a:font script="Ethi" typeface="Nyala"/>
+        <a:font script="Beng" typeface="Vrinda"/>
+        <a:font script="Gujr" typeface="Shruti"/>
+        <a:font script="Khmr" typeface="MoolBoran"/>
+        <a:font script="Knda" typeface="Tunga"/>
+        <a:font script="Guru" typeface="Raavi"/>
+        <a:font script="Cans" typeface="Euphemia"/>
+        <a:font script="Cher" typeface="Plantagenet Cherokee"/>
+        <a:font script="Yiii" typeface="Microsoft Yi Baiti"/>
+        <a:font script="Tibt" typeface="Microsoft Himalaya"/>
+        <a:font script="Thaa" typeface="MV Boli"/>
+        <a:font script="Deva" typeface="Mangal"/>
+        <a:font script="Telu" typeface="Gautami"/>
+        <a:font script="Taml" typeface="Latha"/>
+        <a:font script="Syrc" typeface="Estrangelo Edessa"/>
+        <a:font script="Orya" typeface="Kalinga"/>
+        <a:font script="Mlym" typeface="Kartika"/>
+        <a:font script="Laoo" typeface="DokChampa"/>
+        <a:font script="Sinh" typeface="Iskoola Pota"/>
+        <a:font script="Mong" typeface="Mongolian Baiti"/>
+        <a:font script="Viet" typeface="Times New Roman"/>
+        <a:font script="Uigh" typeface="Microsoft Uighur"/>
+        <a:font script="Geor" typeface="Sylfaen"/>
+        <a:font script="Armn" typeface="Arial"/>
+        <a:font script="Bugi" typeface="Leelawadee UI"/>
+        <a:font script="Bopo" typeface="Microsoft JhengHei"/>
+        <a:font script="Java" typeface="Javanese Text"/>
+        <a:font script="Lisu" typeface="Segoe UI"/>
+        <a:font script="Mymr" typeface="Myanmar Text"/>
+        <a:font script="Nkoo" typeface="Ebrima"/>
+        <a:font script="Olck" typeface="Nirmala UI"/>
+        <a:font script="Osma" typeface="Ebrima"/>
+        <a:font script="Phag" typeface="Phagspa"/>
+        <a:font script="Syrn" typeface="Estrangelo Edessa"/>
+        <a:font script="Syrj" typeface="Estrangelo Edessa"/>
+        <a:font script="Syre" typeface="Estrangelo Edessa"/>
+        <a:font script="Sora" typeface="Nirmala UI"/>
+        <a:font script="Tale" typeface="Microsoft Tai Le"/>
+        <a:font script="Talu" typeface="Microsoft New Tai Lue"/>
+        <a:font script="Tfng" typeface="Ebrima"/>
+      </a:majorFont>
+      <a:minorFont>
+        <a:latin typeface="Aptos" panose="02110004020202020204"/>
+        <a:ea typeface=""/>
+        <a:cs typeface=""/>
+        <a:font script="Jpan" typeface="游明朝"/>
+        <a:font script="Hang" typeface="맑은 고딕"/>
+        <a:font script="Hans" typeface="等线"/>
+        <a:font script="Hant" typeface="新細明體"/>
+        <a:font script="Arab" typeface="Arial"/>
+        <a:font script="Hebr" typeface="Arial"/>
+        <a:font script="Thai" typeface="Cordia New"/>
+        <a:font script="Ethi" typeface="Nyala"/>
+        <a:font script="Beng" typeface="Vrinda"/>
+        <a:font script="Gujr" typeface="Shruti"/>
+        <a:font script="Khmr" typeface="DaunPenh"/>
+        <a:font script="Knda" typeface="Tunga"/>
+        <a:font script="Guru" typeface="Raavi"/>
+        <a:font script="Cans" typeface="Euphemia"/>
+        <a:font script="Cher" typeface="Plantagenet Cherokee"/>
+        <a:font script="Yiii" typeface="Microsoft Yi Baiti"/>
+        <a:font script="Tibt" typeface="Microsoft Himalaya"/>
+        <a:font script="Thaa" typeface="MV Boli"/>
+        <a:font script="Deva" typeface="Mangal"/>
+        <a:font script="Telu" typeface="Gautami"/>
+        <a:font script="Taml" typeface="Latha"/>
+        <a:font script="Syrc" typeface="Estrangelo Edessa"/>
+        <a:font script="Orya" typeface="Kalinga"/>
+        <a:font script="Mlym" typeface="Kartika"/>
+        <a:font script="Laoo" typeface="DokChampa"/>
+        <a:font script="Sinh" typeface="Iskoola Pota"/>
+        <a:font script="Mong" typeface="Mongolian Baiti"/>
+        <a:font script="Viet" typeface="Arial"/>
+        <a:font script="Uigh" typeface="Microsoft Uighur"/>
+        <a:font script="Geor" typeface="Sylfaen"/>
+        <a:font script="Armn" typeface="Arial"/>
+        <a:font script="Bugi" typeface="Leelawadee UI"/>
+        <a:font script="Bopo" typeface="Microsoft JhengHei"/>
+        <a:font script="Java" typeface="Javanese Text"/>
+        <a:font script="Lisu" typeface="Segoe UI"/>
+        <a:font script="Mymr" typeface="Myanmar Text"/>
+        <a:font script="Nkoo" typeface="Ebrima"/>
+        <a:font script="Olck" typeface="Nirmala UI"/>
+        <a:font script="Osma" typeface="Ebrima"/>
+        <a:font script="Phag" typeface="Phagspa"/>
+        <a:font script="Syrn" typeface="Estrangelo Edessa"/>
+        <a:font script="Syrj" typeface="Estrangelo Edessa"/>
+        <a:font script="Syre" typeface="Estrangelo Edessa"/>
+        <a:font script="Sora" typeface="Nirmala UI"/>
+        <a:font script="Tale" typeface="Microsoft Tai Le"/>
+        <a:font script="Talu" typeface="Microsoft New Tai Lue"/>
+        <a:font script="Tfng" typeface="Ebrima"/>
+      </a:minorFont>
+    </a:fontScheme>
+    <a:fmtScheme name="Office">
+      <a:fillStyleLst>
+        <a:solidFill>
+          <a:schemeClr val="phClr"/>
+        </a:solidFill>
+        <a:gradFill rotWithShape="1">
+          <a:gsLst>
+            <a:gs pos="0">
+              <a:schemeClr val="phClr">
+                <a:lumMod val="110000"/>
+                <a:satMod val="105000"/>
+                <a:tint val="67000"/>
+              </a:schemeClr>
+            </a:gs>
+            <a:gs pos="50000">
+              <a:schemeClr val="phClr">
+                <a:lumMod val="105000"/>
+                <a:satMod val="103000"/>
+                <a:tint val="73000"/>
+              </a:schemeClr>
+            </a:gs>
+            <a:gs pos="100000">
+              <a:schemeClr val="phClr">
+                <a:lumMod val="105000"/>
+                <a:satMod val="109000"/>
+                <a:tint val="81000"/>
+              </a:schemeClr>
+            </a:gs>
+          </a:gsLst>
+          <a:lin ang="5400000" scaled="0"/>
+        </a:gradFill>
+        <a:gradFill rotWithShape="1">
+          <a:gsLst>
+            <a:gs pos="0">
+              <a:schemeClr val="phClr">
+                <a:satMod val="103000"/>
+                <a:lumMod val="102000"/>
+                <a:tint val="94000"/>
+              </a:schemeClr>
+            </a:gs>
+            <a:gs pos="50000">
+              <a:schemeClr val="phClr">
+                <a:satMod val="110000"/>
+                <a:lumMod val="100000"/>
+                <a:shade val="100000"/>
+              </a:schemeClr>
+            </a:gs>
+            <a:gs pos="100000">
+              <a:schemeClr val="phClr">
+                <a:lumMod val="99000"/>
+                <a:satMod val="120000"/>
+                <a:shade val="78000"/>
+              </a:schemeClr>
+            </a:gs>
+          </a:gsLst>
+          <a:lin ang="5400000" scaled="0"/>
+        </a:gradFill>
+      </a:fillStyleLst>
+      <a:lnStyleLst>
+        <a:ln w="12700" cap="flat" cmpd="sng" algn="ctr">
+          <a:solidFill>
+            <a:schemeClr val="phClr"/>
+          </a:solidFill>
+          <a:prstDash val="solid"/>
+          <a:miter lim="800000"/>
+        </a:ln>
+        <a:ln w="19050" cap="flat" cmpd="sng" algn="ctr">
+          <a:solidFill>
+            <a:schemeClr val="phClr"/>
+          </a:solidFill>
+          <a:prstDash val="solid"/>
+          <a:miter lim="800000"/>
+        </a:ln>
+        <a:ln w="25400" cap="flat" cmpd="sng" algn="ctr">
+          <a:solidFill>
+            <a:schemeClr val="phClr"/>
+          </a:solidFill>
+          <a:prstDash val="solid"/>
+          <a:miter lim="800000"/>
+        </a:ln>
+      </a:lnStyleLst>
+      <a:effectStyleLst>
+        <a:effectStyle>
+          <a:effectLst/>
+        </a:effectStyle>
+        <a:effectStyle>
+          <a:effectLst/>
+        </a:effectStyle>
+        <a:effectStyle>
+          <a:effectLst>
+            <a:outerShdw blurRad="57150" dist="19050" dir="5400000" algn="ctr" rotWithShape="0">
+              <a:srgbClr val="000000">
+                <a:alpha val="63000"/>
+              </a:srgbClr>
+            </a:outerShdw>
+          </a:effectLst>
+        </a:effectStyle>
+      </a:effectStyleLst>
+      <a:bgFillStyleLst>
+        <a:solidFill>
+          <a:schemeClr val="phClr"/>
+        </a:solidFill>
+        <a:solidFill>
+          <a:schemeClr val="phClr">
+            <a:tint val="95000"/>
+            <a:satMod val="170000"/>
+          </a:schemeClr>
+        </a:solidFill>
+        <a:gradFill rotWithShape="1">
+          <a:gsLst>
+            <a:gs pos="0">
+              <a:schemeClr val="phClr">
+                <a:tint val="93000"/>
+                <a:satMod val="150000"/>
+                <a:shade val="98000"/>
+                <a:lumMod val="102000"/>
+              </a:schemeClr>
+            </a:gs>
+            <a:gs pos="50000">
+              <a:schemeClr val="phClr">
+                <a:tint val="98000"/>
+                <a:satMod val="130000"/>
+                <a:shade val="90000"/>
+                <a:lumMod val="103000"/>
+              </a:schemeClr>
+            </a:gs>
+            <a:gs pos="100000">
+              <a:schemeClr val="phClr">
+                <a:shade val="63000"/>
+                <a:satMod val="120000"/>
+              </a:schemeClr>
+            </a:gs>
+          </a:gsLst>
+          <a:lin ang="5400000" scaled="0"/>
+        </a:gradFill>
+      </a:bgFillStyleLst>
+    </a:fmtScheme>
+  </a:themeElements>
+  <a:objectDefaults>
+    <a:lnDef>
+      <a:spPr/>
+      <a:bodyPr/>
+      <a:lstStyle/>
+      <a:style>
+        <a:lnRef idx="2">
+          <a:schemeClr val="accent1"/>
+        </a:lnRef>
+        <a:fillRef idx="0">
+          <a:schemeClr val="accent1"/>
+        </a:fillRef>
+        <a:effectRef idx="1">
+          <a:schemeClr val="accent1"/>
+        </a:effectRef>
+        <a:fontRef idx="minor">
+          <a:schemeClr val="tx1"/>
+        </a:fontRef>
+      </a:style>
+    </a:lnDef>
+  </a:objectDefaults>
+  <a:extraClrSchemeLst/>
+  <a:extLst>
+    <a:ext uri="{05A4C25C-085E-4340-85A3-A5531E510DB2}">
+      <thm15:themeFamily xmlns:thm15="http://schemas.microsoft.com/office/thememl/2012/main" name="Office Theme" id="{2E142A2C-CD16-42D6-873A-C26D2A0506FA}" vid="{1BDDFF52-6CD6-40A5-AB3C-68EB2F1E4D0A}"/>
+    </a:ext>
+  </a:extLst>
+</a:theme>
 </file>
</xml_diff>